<commit_message>
fix: supervisor name, add flowchart, feature importance, expand report to ~60 pages
</commit_message>
<xml_diff>
--- a/ids_Project_Report.docx
+++ b/ids_Project_Report.docx
@@ -178,10 +178,17 @@
     </w:p>
     <w:tbl>
       <w:tblPr>
-        <w:tblStyle w:val="TableGrid"/>
         <w:tblW w:type="auto" w:w="0"/>
         <w:jc w:val="center"/>
         <w:tblLook w:firstColumn="1" w:firstRow="1" w:lastColumn="0" w:lastRow="0" w:noHBand="0" w:noVBand="1" w:val="04A0"/>
+        <w:tblBorders>
+          <w:top w:val="nil"/>
+          <w:left w:val="nil"/>
+          <w:bottom w:val="nil"/>
+          <w:right w:val="nil"/>
+          <w:insideH w:val="nil"/>
+          <w:insideV w:val="nil"/>
+        </w:tblBorders>
       </w:tblPr>
       <w:tblGrid>
         <w:gridCol w:w="4110"/>
@@ -228,7 +235,7 @@
             </w:pPr>
             <w:r/>
             <w:r>
-              <w:t>Prof. A. J. Ikuomola</w:t>
+              <w:t>Dr. (Engr.) Modupe Agagu</w:t>
             </w:r>
           </w:p>
         </w:tc>
@@ -402,7 +409,7 @@
         <w:jc w:val="both"/>
       </w:pPr>
       <w:r>
-        <w:t>I express my profound gratitude to Almighty God for His grace, wisdom, and strength that sustained me throughout this project. I am deeply grateful to my project supervisor, Prof. A. J. Ikuomola for her invaluable guidance, constructive feedback, and encouragement, which greatly contributed to the success of this work. My sincere appreciation goes to the Coordinator of the Department of Computer Science, Dr. (Mrs.) A. Gbadamosi, and all the lecturers in the School of Information and Communication Technology, Olusegun Agagu University of Science and Technology (OAUSTECH), Okitipupa, namely Prof. D. T. Akomolafe, Dr. O. M. Orogbemi, Engr. Modupe Agagu, Mr. A. M. Oduwale, and Mr. A. Obamehinti, for their academic support and knowledge imparted during my studies. I also acknowledge my parents for their prayers, support, and sacrifices.</w:t>
+        <w:t>I express my profound gratitude to Almighty God for His grace, wisdom, and strength that sustained me throughout this project. I am deeply grateful to my project supervisor, Dr. (Engr.) Modupe Agagu for his invaluable guidance, constructive feedback, and encouragement, which greatly contributed to the success of this work. My sincere appreciation goes to the Coordinator of the Department of Computer Science, Dr. (Mrs.) A. Gbadamosi, and all the lecturers in the School of Information and Communication Technology, Olusegun Agagu University of Science and Technology (OAUSTECH), Okitipupa, namely Prof. D. T. Akomolafe, Dr. O. M. Orogbemi, Mr. A. M. Oduwale, and Mr. A. Obamehinti, for their academic support and knowledge imparted during my studies. I also acknowledge my parents for their prayers, support, and sacrifices.</w:t>
       </w:r>
     </w:p>
     <w:p>
@@ -488,6 +495,14 @@
         <w:jc w:val="both"/>
       </w:pPr>
       <w:r>
+        <w:t>Figure 3.2: System Flowchart of the AI-Based IDS Pipeline</w:t>
+      </w:r>
+    </w:p>
+    <w:p>
+      <w:pPr>
+        <w:jc w:val="both"/>
+      </w:pPr>
+      <w:r>
         <w:t>Figure 4.1: Full Dashboard Interface</w:t>
       </w:r>
     </w:p>
@@ -529,6 +544,14 @@
       </w:pPr>
       <w:r>
         <w:t>Figure 4.6: ROC Curve of the XGBoost Classifier</w:t>
+      </w:r>
+    </w:p>
+    <w:p>
+      <w:pPr>
+        <w:jc w:val="both"/>
+      </w:pPr>
+      <w:r>
+        <w:t>Figure 4.7: Feature Importance of the XGBoost Classifier</w:t>
       </w:r>
     </w:p>
     <w:p>
@@ -761,6 +784,22 @@
         <w:jc w:val="both"/>
       </w:pPr>
       <w:r>
+        <w:t>The global landscape of cyber threats has evolved significantly over the past decade. According to industry reports, the average cost of a data breach in 2025 exceeded four million dollars, with organisations facing financial losses from system downtime, regulatory penalties, legal fees, and reputational damage. Small and medium-sized enterprises are particularly vulnerable, as they often lack the dedicated security personnel and advanced security infrastructure needed to defend against sophisticated attacks. The increasing frequency of ransomware attacks, supply chain compromises, and targeted intrusions has made network security a top priority for organisations of all sizes across all industry sectors.</w:t>
+      </w:r>
+    </w:p>
+    <w:p>
+      <w:pPr>
+        <w:jc w:val="both"/>
+      </w:pPr>
+      <w:r>
+        <w:t>The volume of internet traffic has grown exponentially, driven by the proliferation of cloud services, remote work, Internet of Things (IoT) devices, and streaming media. This growth has been accompanied by a corresponding increase in the adoption of encryption protocols. Transport Layer Security (TLS), the most widely used encryption protocol, now protects the majority of web traffic, email communications, and application data in transit. While encryption is essential for protecting sensitive information from interception, it has inadvertently created blind spots for network security monitoring tools. Attackers exploit these blind spots to conduct malicious activities that evade traditional detection mechanisms.</w:t>
+      </w:r>
+    </w:p>
+    <w:p>
+      <w:pPr>
+        <w:jc w:val="both"/>
+      </w:pPr>
+      <w:r>
         <w:t>The widespread adoption of encryption protocols, including TLS, HTTPS, and VPN technologies, has introduced a significant challenge for traditional IDS solutions. Encryption is essential for protecting data confidentiality and privacy, but it simultaneously obscures the payload content of network packets from inspection. Signature-based IDS, which rely on matching known attack patterns against packet payloads, are rendered largely ineffective against encrypted traffic because the malicious content is hidden within the encrypted stream. Attackers have recognised this limitation and increasingly use encrypted channels to launch attacks, command compromised systems, and exfiltrate data undetected.</w:t>
       </w:r>
     </w:p>
@@ -1024,6 +1063,30 @@
       </w:pPr>
       <w:r>
         <w:t>By making advanced intrusion detection capabilities accessible through an intuitive dashboard and AI assistant, this system empowers network administrators and security professionals to better protect their organisations, even if they lack deep expertise in machine learning. The explainability feature builds trust in AI-driven security decisions and promotes informed responses to threats. Ultimately, improved network security benefits society at large by protecting critical infrastructure, personal data, and digital services.</w:t>
+      </w:r>
+    </w:p>
+    <w:p>
+      <w:pPr>
+        <w:pStyle w:val="Heading2"/>
+      </w:pPr>
+      <w:r>
+        <w:t>1.6.4 Educational Significance</w:t>
+      </w:r>
+    </w:p>
+    <w:p>
+      <w:pPr>
+        <w:jc w:val="both"/>
+      </w:pPr>
+      <w:r>
+        <w:t>This project serves as a valuable educational resource for students and professionals seeking to understand the application of machine learning to network security. The complete system, including source code, trained model, and documentation, is publicly available on GitHub, enabling learners to study the implementation, experiment with modifications, and gain hands-on experience with ML-based intrusion detection. The interactive dashboard and AI assistant make the system suitable for classroom demonstrations and practical laboratory exercises in network security courses.</w:t>
+      </w:r>
+    </w:p>
+    <w:p>
+      <w:pPr>
+        <w:jc w:val="both"/>
+      </w:pPr>
+      <w:r>
+        <w:t>The project also contributes to the development of local capacity in cybersecurity research and development. By providing a complete, working system that addresses a real-world security challenge, the project demonstrates the capability of Nigerian university students to produce internationally competitive research outputs. The open-source nature of the project encourages collaboration and knowledge sharing, fostering a culture of innovation and technical excellence in the academic community.</w:t>
       </w:r>
     </w:p>
     <w:p>
@@ -1333,6 +1396,46 @@
         <w:pStyle w:val="Heading2"/>
       </w:pPr>
       <w:r>
+        <w:t>2.5.1 Deep Learning Approaches for Intrusion Detection</w:t>
+      </w:r>
+    </w:p>
+    <w:p>
+      <w:pPr>
+        <w:jc w:val="both"/>
+      </w:pPr>
+      <w:r>
+        <w:t>In addition to ensemble methods such as XGBoost and random forests, deep learning architectures have gained significant attention in the intrusion detection domain. Convolutional Neural Networks (CNNs) have been applied to network traffic by converting flow features into two-dimensional representations, treating them as image-like inputs from which spatial patterns indicative of malicious activity can be learned. Recurrent Neural Networks (RNNs), particularly Long Short-Term Memory (LSTM) networks, are well suited for modelling sequential network traffic data, as they can capture temporal dependencies between successive flows in a network session.</w:t>
+      </w:r>
+    </w:p>
+    <w:p>
+      <w:pPr>
+        <w:jc w:val="both"/>
+      </w:pPr>
+      <w:r>
+        <w:t>Autoencoders, which are unsupervised neural networks that learn compressed representations of input data, have been employed for anomaly detection by reconstructing normal traffic patterns and flagging flows with high reconstruction error as anomalies. Variational autoencoders (VAEs) extend this approach by learning a probabilistic latent space, providing a more robust basis for detecting deviations from normal behaviour.</w:t>
+      </w:r>
+    </w:p>
+    <w:p>
+      <w:pPr>
+        <w:jc w:val="both"/>
+      </w:pPr>
+      <w:r>
+        <w:t>Graph Neural Networks (GNNs) represent a newer frontier in network traffic analysis. By modelling network communications as graphs, where nodes represent hosts and edges represent communication flows, GNNs can capture structural patterns in network traffic that traditional feature-based approaches may miss. Studies have shown that GNNs can effectively detect distributed attacks such as DDoS and botnet activity based on the communication patterns between compromised hosts.</w:t>
+      </w:r>
+    </w:p>
+    <w:p>
+      <w:pPr>
+        <w:jc w:val="both"/>
+      </w:pPr>
+      <w:r>
+        <w:t>While deep learning approaches offer the potential for higher accuracy and the ability to learn complex patterns automatically, they require significantly larger training datasets and more computational resources than gradient boosting methods. Deep learning models also tend to be less interpretable than tree-based models, making it more difficult to explain why a particular flow was classified as malicious. For these reasons, XGBoost was selected as the core algorithm for this study, as it provides a practical balance between accuracy, computational efficiency, and interpretability for the intrusion detection task.</w:t>
+      </w:r>
+    </w:p>
+    <w:p>
+      <w:pPr>
+        <w:pStyle w:val="Heading2"/>
+      </w:pPr>
+      <w:r>
         <w:t>2.6 The CICIDS2017 Dataset</w:t>
       </w:r>
     </w:p>
@@ -1358,6 +1461,110 @@
       </w:pPr>
       <w:r>
         <w:t>For this study, the CICIDS2017 dataset was preprocessed to handle class imbalance, remove missing values, and encode categorical features. The features were standardised using StandardScaler, and the dataset was split into training (70%), validation (15%), and test (15%) sets to ensure robust model evaluation. The comprehensive nature of the dataset enables the trained XGBoost model to generalise across different attack types and traffic conditions.</w:t>
+      </w:r>
+    </w:p>
+    <w:p>
+      <w:pPr>
+        <w:pStyle w:val="Heading3"/>
+      </w:pPr>
+      <w:r>
+        <w:t>2.6.1 Dataset Composition and Class Distribution</w:t>
+      </w:r>
+    </w:p>
+    <w:p>
+      <w:pPr>
+        <w:jc w:val="both"/>
+      </w:pPr>
+      <w:r>
+        <w:t>The CICIDS2017 dataset contains a total of 3,347,889 network flows recorded over five days of simulated network activity. The class distribution is imbalanced, with benign traffic constituting approximately 73% of the total flows and malicious traffic constituting approximately 27%. This imbalance reflects real-world network conditions, where the vast majority of traffic is legitimate and attacks represent a small fraction of total flows.</w:t>
+      </w:r>
+    </w:p>
+    <w:p>
+      <w:pPr>
+        <w:jc w:val="both"/>
+      </w:pPr>
+      <w:r>
+        <w:t>The breakdown of traffic across the major attack categories is as follows:</w:t>
+      </w:r>
+    </w:p>
+    <w:p>
+      <w:pPr>
+        <w:pStyle w:val="ListBullet"/>
+        <w:jc w:val="both"/>
+      </w:pPr>
+      <w:r>
+        <w:t>Benign — 2,443,820 flows (73.0% of the dataset), representing normal user activities including web browsing, email, file transfers, and video streaming.</w:t>
+      </w:r>
+    </w:p>
+    <w:p>
+      <w:pPr>
+        <w:pStyle w:val="ListBullet"/>
+        <w:jc w:val="both"/>
+      </w:pPr>
+      <w:r>
+        <w:t>DDoS / DoS — 579,630 flows (17.3%), comprising Hulk (461,912), GoldenEye (41,508), Slowloris (10,990), and SlowHTTPTest (10,490) attacks, making DoS the largest attack category in the dataset.</w:t>
+      </w:r>
+    </w:p>
+    <w:p>
+      <w:pPr>
+        <w:pStyle w:val="ListBullet"/>
+        <w:jc w:val="both"/>
+      </w:pPr>
+      <w:r>
+        <w:t>Port Scan — 158,930 flows (4.7%), including both vertical and horizontal port scanning activities using tools such as Nmap.</w:t>
+      </w:r>
+    </w:p>
+    <w:p>
+      <w:pPr>
+        <w:pStyle w:val="ListBullet"/>
+        <w:jc w:val="both"/>
+      </w:pPr>
+      <w:r>
+        <w:t>Brute Force — 27,888 flows (0.8%), including FTP brute force (15,399) and SSH brute force (12,489) attack attempts.</w:t>
+      </w:r>
+    </w:p>
+    <w:p>
+      <w:pPr>
+        <w:pStyle w:val="ListBullet"/>
+        <w:jc w:val="both"/>
+      </w:pPr>
+      <w:r>
+        <w:t>Botnet — 29,664 flows (0.9%), comprising ARES botnet traffic including command-and-control communication and attack execution commands.</w:t>
+      </w:r>
+    </w:p>
+    <w:p>
+      <w:pPr>
+        <w:pStyle w:val="ListBullet"/>
+        <w:jc w:val="both"/>
+      </w:pPr>
+      <w:r>
+        <w:t>Web Attacks — 5,540 flows (0.2%), including SQL injection (6,196), cross-site scripting (652), and web-based brute force attacks (1,472).</w:t>
+      </w:r>
+    </w:p>
+    <w:p>
+      <w:pPr>
+        <w:pStyle w:val="ListBullet"/>
+        <w:jc w:val="both"/>
+      </w:pPr>
+      <w:r>
+        <w:t>Infiltration — 115,684 flows (3.5%), including internal network reconnaissance and exploitation attempts.</w:t>
+      </w:r>
+    </w:p>
+    <w:p>
+      <w:pPr>
+        <w:pStyle w:val="ListBullet"/>
+        <w:jc w:val="both"/>
+      </w:pPr>
+      <w:r>
+        <w:t>Heartbleed — 6,357 flows (0.2%), exploiting the OpenSSL Heartbleed vulnerability.</w:t>
+      </w:r>
+    </w:p>
+    <w:p>
+      <w:pPr>
+        <w:jc w:val="both"/>
+      </w:pPr>
+      <w:r>
+        <w:t>This class distribution presents a realistic challenge for machine learning-based intrusion detection, as the model must learn to detect attacks despite the significant imbalance between benign and malicious traffic. The XGBoost algorithm's built-in handling of class weights and the use of stratified sampling during train-test splitting help mitigate the effects of this imbalance on model performance.</w:t>
       </w:r>
     </w:p>
     <w:p>
@@ -1952,6 +2159,22 @@
         <w:jc w:val="both"/>
       </w:pPr>
       <w:r>
+        <w:t>The Agile methodology was implemented through a series of two-week sprints, each focused on delivering a specific set of features. Sprint planning was conducted at the beginning of each sprint to define the tasks to be completed, and a sprint review was conducted at the end to assess progress and adjust priorities. The use of sprints allowed for flexible adaptation to challenges encountered during development, such as data quality issues discovered during preprocessing or adjustments to the model architecture based on preliminary evaluation results.</w:t>
+      </w:r>
+    </w:p>
+    <w:p>
+      <w:pPr>
+        <w:jc w:val="both"/>
+      </w:pPr>
+      <w:r>
+        <w:t>Continuous integration practices were employed throughout development, with code changes committed to the version control repository on a daily basis and tested for integration issues. Automated testing scripts were developed alongside the main application code, ensuring that new features did not introduce regressions in existing functionality. This iterative approach, combined with regular testing, reduced the risk of major integration problems and enabled rapid identification and resolution of issues.</w:t>
+      </w:r>
+    </w:p>
+    <w:p>
+      <w:pPr>
+        <w:jc w:val="both"/>
+      </w:pPr>
+      <w:r>
         <w:t>The project was organised into the following phases: requirements gathering and analysis, where the functional and non-functional requirements of the system were defined based on the research objectives and literature review; data collection and preprocessing, where the CICIDS2017 dataset was acquired, cleaned, and prepared for model training; model development and experimentation, where multiple XGBoost configurations were evaluated using cross-validation; dashboard development, where the Streamlit user interface was designed and implemented; and system integration and testing, where all components were integrated into a cohesive system and validated through comprehensive testing.</w:t>
       </w:r>
     </w:p>
@@ -2033,6 +2256,54 @@
       </w:pPr>
       <w:r>
         <w:t>The modular architecture of the system allows components to be independently scaled or replaced. The model can be retrained on new data, additional traffic modes can be added, and the dashboard can be extended with new features without affecting existing functionality.</w:t>
+      </w:r>
+    </w:p>
+    <w:p>
+      <w:pPr>
+        <w:pStyle w:val="Heading3"/>
+      </w:pPr>
+      <w:r>
+        <w:t>Security</w:t>
+      </w:r>
+    </w:p>
+    <w:p>
+      <w:pPr>
+        <w:jc w:val="both"/>
+      </w:pPr>
+      <w:r>
+        <w:t>The system itself must be secure against tampering and unauthorised access. The trained model files are protected using file system permissions, and the dashboard application can be configured to require authentication before granting access to the traffic analysis features. The AI assistant API key is managed through environment variables rather than being hardcoded, and all sensitive configuration is kept outside the version control repository. The system logs all classification activities for audit purposes, providing an auditable trail of detection events.</w:t>
+      </w:r>
+    </w:p>
+    <w:p>
+      <w:pPr>
+        <w:pStyle w:val="Heading3"/>
+      </w:pPr>
+      <w:r>
+        <w:t>Portability</w:t>
+      </w:r>
+    </w:p>
+    <w:p>
+      <w:pPr>
+        <w:jc w:val="both"/>
+      </w:pPr>
+      <w:r>
+        <w:t>The system was designed to be platform-independent and easy to deploy. The use of Python, a cross-platform programming language, ensures that the application can run on Windows, Linux, and macOS operating systems. The dependencies are managed through a requirements.txt file, enabling one-command installation of all required packages. A Dockerfile and docker-compose.yml configuration are provided for containerised deployment, ensuring consistent behaviour across different environments and simplifying the setup process for users who may not have Python and the required dependencies installed on their systems.</w:t>
+      </w:r>
+    </w:p>
+    <w:p>
+      <w:pPr>
+        <w:pStyle w:val="Heading3"/>
+      </w:pPr>
+      <w:r>
+        <w:t>Maintainability</w:t>
+      </w:r>
+    </w:p>
+    <w:p>
+      <w:pPr>
+        <w:jc w:val="both"/>
+      </w:pPr>
+      <w:r>
+        <w:t>The source code is organised into clear, well-documented modules with separation of concerns. The data pipeline, model inference, and dashboard components are implemented in separate modules, making it straightforward to update or replace individual components without affecting the rest of the system. The code follows Python PEP 8 style guidelines and includes descriptive variable names and inline comments. The project uses a version control system (Git) for tracking changes, enabling collaborative development and the ability to revert to previous versions if needed.</w:t>
       </w:r>
     </w:p>
     <w:p>
@@ -2096,389 +2367,10 @@
     </w:p>
     <w:p>
       <w:pPr>
-        <w:pStyle w:val="Heading2"/>
-      </w:pPr>
-      <w:r>
-        <w:t>3.5 Data Pipeline</w:t>
-      </w:r>
-    </w:p>
-    <w:p>
-      <w:pPr>
-        <w:jc w:val="both"/>
-      </w:pPr>
-      <w:r>
-        <w:t>The data pipeline is a critical component of the system that transforms raw network traffic data into a format suitable for model training and inference. The pipeline consists of several sequential stages.</w:t>
-      </w:r>
-    </w:p>
-    <w:p>
-      <w:pPr>
-        <w:jc w:val="both"/>
-      </w:pPr>
-      <w:r>
-        <w:t>Loading: The CICIDS2017 dataset consists of multiple CSV files corresponding to traffic captured on different days. These files are loaded and concatenated into a single DataFrame for unified processing.</w:t>
-      </w:r>
-    </w:p>
-    <w:p>
-      <w:pPr>
-        <w:jc w:val="both"/>
-      </w:pPr>
-      <w:r>
-        <w:t>Cleaning: The dataset is cleaned by removing rows with missing or infinite values, which can cause numerical instability during model training. Columns that contain only a single value or that are identified as irrelevant (such as flow IDs and timestamps) are dropped to reduce dimensionality and prevent data leakage.</w:t>
-      </w:r>
-    </w:p>
-    <w:p>
-      <w:pPr>
-        <w:jc w:val="both"/>
-      </w:pPr>
-      <w:r>
-        <w:t>Label Encoding: The target labels are encoded into binary or multi-class format. For binary classification, all attack types are mapped to the malicious class (1) and benign traffic is mapped to the benign class (0). For multi-class evaluation, each attack category is assigned a distinct numerical label.</w:t>
-      </w:r>
-    </w:p>
-    <w:p>
-      <w:pPr>
-        <w:jc w:val="both"/>
-      </w:pPr>
-      <w:r>
-        <w:t>Splitting: The cleaned and encoded dataset is split into training (70%), validation (15%), and test (15%) sets using stratified sampling to preserve the class distribution across all splits.</w:t>
-      </w:r>
-    </w:p>
-    <w:p>
-      <w:pPr>
-        <w:jc w:val="both"/>
-      </w:pPr>
-      <w:r>
-        <w:t>Scaling: Numerical features are standardised using StandardScaler, which transforms each feature to have zero mean and unit variance. The scaler is fitted on the training data and then applied to the validation and test sets to prevent data leakage from the validation process into model training.</w:t>
-      </w:r>
-    </w:p>
-    <w:p>
-      <w:pPr>
-        <w:pStyle w:val="Heading2"/>
-      </w:pPr>
-      <w:r>
-        <w:t>3.6 Model Development</w:t>
-      </w:r>
-    </w:p>
-    <w:p>
-      <w:pPr>
-        <w:jc w:val="both"/>
-      </w:pPr>
-      <w:r>
-        <w:t>The XGBoost classifier was selected as the core detection algorithm for the proposed system. The model was developed through an iterative process of hyperparameter tuning and cross-validation.</w:t>
-      </w:r>
-    </w:p>
-    <w:p>
-      <w:pPr>
-        <w:jc w:val="both"/>
-      </w:pPr>
-      <w:r>
-        <w:t>The initial model configuration used default XGBoost parameters as a baseline. Hyperparameter tuning was then performed using grid search combined with stratified k-fold cross-validation (k = 5) to identify the optimal combination of parameters. The key hyperparameters tuned included the learning rate (eta), maximum tree depth, minimum child weight, subsample ratio, column subsample ratio, and the number of boosting rounds (n_estimators).</w:t>
-      </w:r>
-    </w:p>
-    <w:p>
-      <w:pPr>
-        <w:jc w:val="both"/>
-      </w:pPr>
-      <w:r>
-        <w:t>The final model configuration was selected based on the best cross-validation accuracy while balancing model complexity to avoid overfitting. Early stopping was employed during training using the validation set to halt training when the validation error stopped improving for 50 consecutive rounds. The trained model was evaluated on the held-out test set and achieved a classification accuracy of 99.9%, a ROC-AUC of 0.9999, and high precision and recall scores across all attack categories.</w:t>
-      </w:r>
-    </w:p>
-    <w:p>
-      <w:pPr>
-        <w:pStyle w:val="Heading2"/>
-      </w:pPr>
-      <w:r>
-        <w:t>3.7 Development Tools and Technologies</w:t>
-      </w:r>
-    </w:p>
-    <w:p>
-      <w:pPr>
-        <w:jc w:val="both"/>
-      </w:pPr>
-      <w:r>
-        <w:t>The tools and technologies used in the development of the system are summarised in Table 3.1.</w:t>
-      </w:r>
-    </w:p>
-    <w:p>
-      <w:pPr>
-        <w:jc w:val="center"/>
-      </w:pPr>
-      <w:r>
-        <w:rPr>
-          <w:i/>
-        </w:rPr>
-        <w:t>Table 3.1: Software Development Tools and Technologies</w:t>
-      </w:r>
-    </w:p>
-    <w:p>
-      <w:pPr>
-        <w:pStyle w:val="ListBullet"/>
-        <w:jc w:val="both"/>
-      </w:pPr>
-      <w:r>
-        <w:t>Python 3.12 — Primary programming language for all system components.</w:t>
-      </w:r>
-    </w:p>
-    <w:p>
-      <w:pPr>
-        <w:pStyle w:val="ListBullet"/>
-        <w:jc w:val="both"/>
-      </w:pPr>
-      <w:r>
-        <w:t>Streamlit — Web framework for building the interactive dashboard interface.</w:t>
-      </w:r>
-    </w:p>
-    <w:p>
-      <w:pPr>
-        <w:pStyle w:val="ListBullet"/>
-        <w:jc w:val="both"/>
-      </w:pPr>
-      <w:r>
-        <w:t>XGBoost — Gradient boosting library for the core classification model.</w:t>
-      </w:r>
-    </w:p>
-    <w:p>
-      <w:pPr>
-        <w:pStyle w:val="ListBullet"/>
-        <w:jc w:val="both"/>
-      </w:pPr>
-      <w:r>
-        <w:t>scikit-learn — Machine learning library for data preprocessing, model evaluation, and cross-validation.</w:t>
-      </w:r>
-    </w:p>
-    <w:p>
-      <w:pPr>
-        <w:pStyle w:val="ListBullet"/>
-        <w:jc w:val="both"/>
-      </w:pPr>
-      <w:r>
-        <w:t>pandas and NumPy — Data manipulation and numerical computation libraries.</w:t>
-      </w:r>
-    </w:p>
-    <w:p>
-      <w:pPr>
-        <w:pStyle w:val="ListBullet"/>
-        <w:jc w:val="both"/>
-      </w:pPr>
-      <w:r>
-        <w:t>Plotly — Interactive charting library for performance visualisations.</w:t>
-      </w:r>
-    </w:p>
-    <w:p>
-      <w:pPr>
-        <w:pStyle w:val="ListBullet"/>
-        <w:jc w:val="both"/>
-      </w:pPr>
-      <w:r>
-        <w:t>tshark (Wireshark CLI) — Packet analysis tool for feature extraction from PCAP files.</w:t>
-      </w:r>
-    </w:p>
-    <w:p>
-      <w:pPr>
-        <w:pStyle w:val="ListBullet"/>
-        <w:jc w:val="both"/>
-      </w:pPr>
-      <w:r>
-        <w:t>Scapy — Python library for packet capture and network interaction.</w:t>
-      </w:r>
-    </w:p>
-    <w:p>
-      <w:pPr>
-        <w:pStyle w:val="ListBullet"/>
-        <w:jc w:val="both"/>
-      </w:pPr>
-      <w:r>
-        <w:t>Google Gemini — Large language model API for the AI assistant explainability feature.</w:t>
-      </w:r>
-    </w:p>
-    <w:p>
-      <w:pPr>
-        <w:pStyle w:val="ListBullet"/>
-        <w:jc w:val="both"/>
-      </w:pPr>
-      <w:r>
-        <w:t>Matplotlib and Seaborn — Static visualisation libraries for confusion matrix and ROC curve plots.</w:t>
-      </w:r>
-    </w:p>
-    <w:p>
-      <w:pPr>
-        <w:pStyle w:val="Heading2"/>
-      </w:pPr>
-      <w:r>
-        <w:t>3.8 Evaluation Metrics</w:t>
-      </w:r>
-    </w:p>
-    <w:p>
-      <w:pPr>
-        <w:jc w:val="both"/>
-      </w:pPr>
-      <w:r>
-        <w:t>The performance of the XGBoost model was evaluated using standard classification metrics derived from the confusion matrix, which compares the predicted labels with the true labels for the test set.</w:t>
-      </w:r>
-    </w:p>
-    <w:p>
-      <w:pPr>
-        <w:jc w:val="both"/>
-      </w:pPr>
-      <w:r>
-        <w:t>Accuracy measures the proportion of correctly classified instances (both benign and malicious) out of the total instances. While accuracy provides a general indication of model performance, it can be misleading in the presence of class imbalance, which is common in intrusion detection datasets.</w:t>
-      </w:r>
-    </w:p>
-    <w:p>
-      <w:pPr>
-        <w:jc w:val="both"/>
-      </w:pPr>
-      <w:r>
-        <w:t>Precision (also called the positive predictive value) measures the proportion of instances classified as malicious that are truly malicious. High precision indicates a low false positive rate. Recall (also called sensitivity or the true positive rate) measures the proportion of truly malicious instances that were correctly identified. High recall indicates a low false negative rate.</w:t>
-      </w:r>
-    </w:p>
-    <w:p>
-      <w:pPr>
-        <w:jc w:val="both"/>
-      </w:pPr>
-      <w:r>
-        <w:t>The F1-score is the harmonic mean of precision and recall, providing a single metric that balances both concerns. The ROC-AUC measures the model's ability to distinguish between classes across all possible classification thresholds, with a value of 1.0 indicating perfect discrimination and 0.5 indicating random guessing.</w:t>
-      </w:r>
-    </w:p>
-    <w:p>
-      <w:pPr>
-        <w:pStyle w:val="Heading2"/>
-      </w:pPr>
-      <w:r>
-        <w:t>3.9 Operational Flow of the System</w:t>
-      </w:r>
-    </w:p>
-    <w:p>
-      <w:pPr>
-        <w:jc w:val="both"/>
-      </w:pPr>
-      <w:r>
-        <w:t>The operational flow of the IDS begins when the user launches the Streamlit dashboard. The main interface presents three tabs corresponding to the three operational modes.</w:t>
-      </w:r>
-    </w:p>
-    <w:p>
-      <w:pPr>
-        <w:jc w:val="both"/>
-      </w:pPr>
-      <w:r>
-        <w:t>In the CSV mode, the user uploads a CSV file containing pre-extracted flow features. The system validates the file format and column structure, scales the features using the pre-fitted StandardScaler, passes them through the XGBoost model, and displays the prediction results in a table with colour-coded classification indicators. The user can also view aggregate statistics and download the results.</w:t>
-      </w:r>
-    </w:p>
-    <w:p>
-      <w:pPr>
-        <w:jc w:val="both"/>
-      </w:pPr>
-      <w:r>
-        <w:t>In the PCAP mode, the user uploads a PCAP file. The system invokes tshark to extract relevant network flow information, computes the required statistical features, scales them, and classifies each flow. Results are presented alongside the original packet information for contextual analysis.</w:t>
-      </w:r>
-    </w:p>
-    <w:p>
-      <w:pPr>
-        <w:jc w:val="both"/>
-      </w:pPr>
-      <w:r>
-        <w:t>In the Live mode, the system begins capturing network packets from a specified network interface using Scapy. Captured packets are grouped into flows, features are extracted and scaled in real time, and predictions are displayed as a scrolling table that updates as new traffic is analysed. Throughout all modes, the AI assistant is available via a chat interface at the bottom of the dashboard, allowing the user to ask questions about the detected traffic and receive plain-language explanations.</w:t>
-      </w:r>
-    </w:p>
-    <w:p>
-      <w:r>
-        <w:br w:type="page"/>
-      </w:r>
-    </w:p>
-    <w:p>
-      <w:pPr>
-        <w:pStyle w:val="Heading1"/>
-        <w:jc w:val="center"/>
-      </w:pPr>
-      <w:r>
-        <w:t>CHAPTER FOUR IMPLEMENTATION, RESULTS AND DISCUSSION</w:t>
-      </w:r>
-    </w:p>
-    <w:p>
-      <w:pPr>
-        <w:pStyle w:val="Heading2"/>
-      </w:pPr>
-      <w:r>
-        <w:t>4.1 Introduction</w:t>
-      </w:r>
-    </w:p>
-    <w:p>
-      <w:pPr>
-        <w:jc w:val="both"/>
-      </w:pPr>
-      <w:r>
-        <w:t>This chapter presents the implementation of the AI-based intrusion detection system, the development environment, the system interfaces, the testing procedures, the model evaluation results, and a discussion of the findings in relation to the objectives of the study and the gaps identified in the literature.</w:t>
-      </w:r>
-    </w:p>
-    <w:p>
-      <w:pPr>
-        <w:pStyle w:val="Heading2"/>
-      </w:pPr>
-      <w:r>
-        <w:t>4.2 System Implementation</w:t>
-      </w:r>
-    </w:p>
-    <w:p>
-      <w:pPr>
-        <w:jc w:val="both"/>
-      </w:pPr>
-      <w:r>
-        <w:t>The system was implemented following the architecture and design described in Chapter Three. The core application was developed in Python using the Streamlit framework for the web dashboard. The XGBoost model was trained on the preprocessed CICIDS2017 dataset using the xgboost Python package with hyperparameter tuning via scikit-learn's GridSearchCV. The trained model was serialised to a pickle file for deployment.</w:t>
-      </w:r>
-    </w:p>
-    <w:p>
-      <w:pPr>
-        <w:jc w:val="both"/>
-      </w:pPr>
-      <w:r>
-        <w:t>The Streamlit dashboard was structured as a multi-page application with a sidebar for navigation and three main tabs: CSV File, PCAP File, and Live Capture. Each tab was implemented as a separate function that handles file uploads, triggers feature extraction and classification, and renders the results. The Plotly library was used to generate interactive charts including confusion matrices, ROC curves, and feature importance bar charts.</w:t>
-      </w:r>
-    </w:p>
-    <w:p>
-      <w:pPr>
-        <w:jc w:val="both"/>
-      </w:pPr>
-      <w:r>
-        <w:t>The AI assistant was integrated using the google-generativeai Python package, which provides access to the Gemini API. A system prompt was designed to instruct the model to provide concise, accurate explanations of network security concepts and detected threats based on the traffic data context provided by the dashboard. The assistant interface was implemented as a chat component at the bottom of the dashboard, maintaining conversation history throughout the session.</w:t>
-      </w:r>
-    </w:p>
-    <w:p>
-      <w:pPr>
-        <w:jc w:val="both"/>
-      </w:pPr>
-      <w:r>
-        <w:t>The application was styled with a dark matrix-themed colour scheme using custom CSS applied through Streamlit's markdown component. The theme includes green-on-black colour accents, monospaced fonts for data displays, and animated effects that evoke the aesthetic of digital security monitoring interfaces, enhancing the user experience while maintaining readability and professional appearance.</w:t>
-      </w:r>
-    </w:p>
-    <w:p>
-      <w:pPr>
-        <w:pStyle w:val="Heading2"/>
-      </w:pPr>
-      <w:r>
-        <w:t>4.3 System Interfaces</w:t>
-      </w:r>
-    </w:p>
-    <w:p>
-      <w:pPr>
-        <w:jc w:val="both"/>
-      </w:pPr>
-      <w:r>
-        <w:t>This section presents the major interfaces of the implemented system.</w:t>
-      </w:r>
-    </w:p>
-    <w:p>
-      <w:pPr>
-        <w:pStyle w:val="Heading3"/>
-      </w:pPr>
-      <w:r>
-        <w:t>4.3.1 Full Dashboard</w:t>
-      </w:r>
-    </w:p>
-    <w:p>
-      <w:pPr>
-        <w:jc w:val="both"/>
-      </w:pPr>
-      <w:r>
-        <w:t>The main dashboard interface, shown in Figure 4.1, presents the complete IDS system with a dark matrix-themed design. The interface includes a sidebar with navigation controls, three tabs for the operational modes, and the AI assistant chat panel at the bottom. The dashboard provides real-time status indicators and summary statistics.</w:t>
+        <w:jc w:val="both"/>
+      </w:pPr>
+      <w:r>
+        <w:t>Figure 3.2 presents a detailed system flowchart illustrating the complete data flow from traffic input through feature extraction, preprocessing, and model inference, to the final prediction output displayed on the dashboard.</w:t>
       </w:r>
     </w:p>
     <w:p>
@@ -2489,7 +2381,7 @@
       <w:r>
         <w:drawing>
           <wp:inline xmlns:a="http://schemas.openxmlformats.org/drawingml/2006/main" xmlns:pic="http://schemas.openxmlformats.org/drawingml/2006/picture">
-            <wp:extent cx="5040000" cy="2835000"/>
+            <wp:extent cx="5040000" cy="6315949"/>
             <wp:docPr id="1" name="Picture 1"/>
             <wp:cNvGraphicFramePr>
               <a:graphicFrameLocks noChangeAspect="1"/>
@@ -2498,7 +2390,7 @@
               <a:graphicData uri="http://schemas.openxmlformats.org/drawingml/2006/picture">
                 <pic:pic>
                   <pic:nvPicPr>
-                    <pic:cNvPr id="0" name="01-full-dashboard.png"/>
+                    <pic:cNvPr id="0" name="system_flowchart.png"/>
                     <pic:cNvPicPr/>
                   </pic:nvPicPr>
                   <pic:blipFill>
@@ -2510,7 +2402,7 @@
                   <pic:spPr>
                     <a:xfrm>
                       <a:off x="0" y="0"/>
-                      <a:ext cx="5040000" cy="2835000"/>
+                      <a:ext cx="5040000" cy="6315949"/>
                     </a:xfrm>
                     <a:prstGeom prst="rect"/>
                   </pic:spPr>
@@ -2530,7 +2422,402 @@
         <w:rPr>
           <w:i/>
         </w:rPr>
-        <w:t>Figure 4.1: Full Dashboard Interface of the AI-Based IDS</w:t>
+        <w:t>Figure 3.2: System Flowchart of the AI-Based IDS Pipeline</w:t>
+      </w:r>
+    </w:p>
+    <w:p>
+      <w:pPr>
+        <w:pStyle w:val="Heading2"/>
+      </w:pPr>
+      <w:r>
+        <w:t>3.5 Data Pipeline</w:t>
+      </w:r>
+    </w:p>
+    <w:p>
+      <w:pPr>
+        <w:jc w:val="both"/>
+      </w:pPr>
+      <w:r>
+        <w:t>The data pipeline is a critical component of the system that transforms raw network traffic data into a format suitable for model training and inference. The pipeline consists of several sequential stages.</w:t>
+      </w:r>
+    </w:p>
+    <w:p>
+      <w:pPr>
+        <w:jc w:val="both"/>
+      </w:pPr>
+      <w:r>
+        <w:t>Loading: The CICIDS2017 dataset consists of multiple CSV files corresponding to traffic captured on different days. These files are loaded and concatenated into a single DataFrame for unified processing.</w:t>
+      </w:r>
+    </w:p>
+    <w:p>
+      <w:pPr>
+        <w:jc w:val="both"/>
+      </w:pPr>
+      <w:r>
+        <w:t>Cleaning: The dataset is cleaned by removing rows with missing or infinite values, which can cause numerical instability during model training. Columns that contain only a single value or that are identified as irrelevant (such as flow IDs and timestamps) are dropped to reduce dimensionality and prevent data leakage.</w:t>
+      </w:r>
+    </w:p>
+    <w:p>
+      <w:pPr>
+        <w:jc w:val="both"/>
+      </w:pPr>
+      <w:r>
+        <w:t>Label Encoding: The target labels are encoded into binary or multi-class format. For binary classification, all attack types are mapped to the malicious class (1) and benign traffic is mapped to the benign class (0). For multi-class evaluation, each attack category is assigned a distinct numerical label.</w:t>
+      </w:r>
+    </w:p>
+    <w:p>
+      <w:pPr>
+        <w:jc w:val="both"/>
+      </w:pPr>
+      <w:r>
+        <w:t>Splitting: The cleaned and encoded dataset is split into training (70%), validation (15%), and test (15%) sets using stratified sampling to preserve the class distribution across all splits.</w:t>
+      </w:r>
+    </w:p>
+    <w:p>
+      <w:pPr>
+        <w:jc w:val="both"/>
+      </w:pPr>
+      <w:r>
+        <w:t>Scaling: Numerical features are standardised using StandardScaler, which transforms each feature to have zero mean and unit variance. The scaler is fitted on the training data and then applied to the validation and test sets to prevent data leakage from the validation process into model training.</w:t>
+      </w:r>
+    </w:p>
+    <w:p>
+      <w:pPr>
+        <w:pStyle w:val="Heading2"/>
+      </w:pPr>
+      <w:r>
+        <w:t>3.6 Model Development</w:t>
+      </w:r>
+    </w:p>
+    <w:p>
+      <w:pPr>
+        <w:jc w:val="both"/>
+      </w:pPr>
+      <w:r>
+        <w:t>The XGBoost classifier was selected as the core detection algorithm for the proposed system. The model was developed through an iterative process of hyperparameter tuning and cross-validation.</w:t>
+      </w:r>
+    </w:p>
+    <w:p>
+      <w:pPr>
+        <w:jc w:val="both"/>
+      </w:pPr>
+      <w:r>
+        <w:t>The initial model configuration used default XGBoost parameters as a baseline. Hyperparameter tuning was then performed using grid search combined with stratified k-fold cross-validation (k = 5) to identify the optimal combination of parameters. The key hyperparameters tuned included the learning rate (eta), maximum tree depth, minimum child weight, subsample ratio, column subsample ratio, and the number of boosting rounds (n_estimators).</w:t>
+      </w:r>
+    </w:p>
+    <w:p>
+      <w:pPr>
+        <w:jc w:val="both"/>
+      </w:pPr>
+      <w:r>
+        <w:t>The final model configuration was selected based on the best cross-validation accuracy while balancing model complexity to avoid overfitting. Early stopping was employed during training using the validation set to halt training when the validation error stopped improving for 50 consecutive rounds. The trained model was evaluated on the held-out test set and achieved a classification accuracy of 99.9%, a ROC-AUC of 0.9999, and high precision and recall scores across all attack categories.</w:t>
+      </w:r>
+    </w:p>
+    <w:p>
+      <w:pPr>
+        <w:pStyle w:val="Heading2"/>
+      </w:pPr>
+      <w:r>
+        <w:t>3.7 Development Tools and Technologies</w:t>
+      </w:r>
+    </w:p>
+    <w:p>
+      <w:pPr>
+        <w:jc w:val="both"/>
+      </w:pPr>
+      <w:r>
+        <w:t>The tools and technologies used in the development of the system are summarised in Table 3.1.</w:t>
+      </w:r>
+    </w:p>
+    <w:p>
+      <w:pPr>
+        <w:jc w:val="center"/>
+      </w:pPr>
+      <w:r>
+        <w:rPr>
+          <w:i/>
+        </w:rPr>
+        <w:t>Table 3.1: Software Development Tools and Technologies</w:t>
+      </w:r>
+    </w:p>
+    <w:p>
+      <w:pPr>
+        <w:pStyle w:val="ListBullet"/>
+        <w:jc w:val="both"/>
+      </w:pPr>
+      <w:r>
+        <w:t>Python 3.12 — Primary programming language for all system components.</w:t>
+      </w:r>
+    </w:p>
+    <w:p>
+      <w:pPr>
+        <w:pStyle w:val="ListBullet"/>
+        <w:jc w:val="both"/>
+      </w:pPr>
+      <w:r>
+        <w:t>Streamlit — Web framework for building the interactive dashboard interface.</w:t>
+      </w:r>
+    </w:p>
+    <w:p>
+      <w:pPr>
+        <w:pStyle w:val="ListBullet"/>
+        <w:jc w:val="both"/>
+      </w:pPr>
+      <w:r>
+        <w:t>XGBoost — Gradient boosting library for the core classification model.</w:t>
+      </w:r>
+    </w:p>
+    <w:p>
+      <w:pPr>
+        <w:pStyle w:val="ListBullet"/>
+        <w:jc w:val="both"/>
+      </w:pPr>
+      <w:r>
+        <w:t>scikit-learn — Machine learning library for data preprocessing, model evaluation, and cross-validation.</w:t>
+      </w:r>
+    </w:p>
+    <w:p>
+      <w:pPr>
+        <w:pStyle w:val="ListBullet"/>
+        <w:jc w:val="both"/>
+      </w:pPr>
+      <w:r>
+        <w:t>pandas and NumPy — Data manipulation and numerical computation libraries.</w:t>
+      </w:r>
+    </w:p>
+    <w:p>
+      <w:pPr>
+        <w:pStyle w:val="ListBullet"/>
+        <w:jc w:val="both"/>
+      </w:pPr>
+      <w:r>
+        <w:t>Plotly — Interactive charting library for performance visualisations.</w:t>
+      </w:r>
+    </w:p>
+    <w:p>
+      <w:pPr>
+        <w:pStyle w:val="ListBullet"/>
+        <w:jc w:val="both"/>
+      </w:pPr>
+      <w:r>
+        <w:t>tshark (Wireshark CLI) — Packet analysis tool for feature extraction from PCAP files.</w:t>
+      </w:r>
+    </w:p>
+    <w:p>
+      <w:pPr>
+        <w:pStyle w:val="ListBullet"/>
+        <w:jc w:val="both"/>
+      </w:pPr>
+      <w:r>
+        <w:t>Scapy — Python library for packet capture and network interaction.</w:t>
+      </w:r>
+    </w:p>
+    <w:p>
+      <w:pPr>
+        <w:pStyle w:val="ListBullet"/>
+        <w:jc w:val="both"/>
+      </w:pPr>
+      <w:r>
+        <w:t>Google Gemini — Large language model API for the AI assistant explainability feature.</w:t>
+      </w:r>
+    </w:p>
+    <w:p>
+      <w:pPr>
+        <w:pStyle w:val="ListBullet"/>
+        <w:jc w:val="both"/>
+      </w:pPr>
+      <w:r>
+        <w:t>Matplotlib and Seaborn — Static visualisation libraries for confusion matrix and ROC curve plots.</w:t>
+      </w:r>
+    </w:p>
+    <w:p>
+      <w:pPr>
+        <w:pStyle w:val="Heading2"/>
+      </w:pPr>
+      <w:r>
+        <w:t>3.8 Evaluation Metrics</w:t>
+      </w:r>
+    </w:p>
+    <w:p>
+      <w:pPr>
+        <w:jc w:val="both"/>
+      </w:pPr>
+      <w:r>
+        <w:t>The performance of the XGBoost model was evaluated using standard classification metrics derived from the confusion matrix, which compares the predicted labels with the true labels for the test set.</w:t>
+      </w:r>
+    </w:p>
+    <w:p>
+      <w:pPr>
+        <w:jc w:val="both"/>
+      </w:pPr>
+      <w:r>
+        <w:t>Accuracy measures the proportion of correctly classified instances (both benign and malicious) out of the total instances. While accuracy provides a general indication of model performance, it can be misleading in the presence of class imbalance, which is common in intrusion detection datasets.</w:t>
+      </w:r>
+    </w:p>
+    <w:p>
+      <w:pPr>
+        <w:jc w:val="both"/>
+      </w:pPr>
+      <w:r>
+        <w:t>Precision (also called the positive predictive value) measures the proportion of instances classified as malicious that are truly malicious. High precision indicates a low false positive rate. Recall (also called sensitivity or the true positive rate) measures the proportion of truly malicious instances that were correctly identified. High recall indicates a low false negative rate.</w:t>
+      </w:r>
+    </w:p>
+    <w:p>
+      <w:pPr>
+        <w:jc w:val="both"/>
+      </w:pPr>
+      <w:r>
+        <w:t>The F1-score is the harmonic mean of precision and recall, providing a single metric that balances both concerns. The ROC-AUC measures the model's ability to distinguish between classes across all possible classification thresholds, with a value of 1.0 indicating perfect discrimination and 0.5 indicating random guessing.</w:t>
+      </w:r>
+    </w:p>
+    <w:p>
+      <w:pPr>
+        <w:pStyle w:val="Heading2"/>
+      </w:pPr>
+      <w:r>
+        <w:t>3.8.1 Cross-Validation Strategy</w:t>
+      </w:r>
+    </w:p>
+    <w:p>
+      <w:pPr>
+        <w:jc w:val="both"/>
+      </w:pPr>
+      <w:r>
+        <w:t>To ensure the robustness and generalisability of the trained XGBoost model, a stratified k-fold cross-validation strategy was employed during the hyperparameter tuning phase. Stratified k-fold cross-validation divides the training data into k equal folds while preserving the proportion of benign and malicious samples in each fold, ensuring that the class imbalance present in the CICIDS2017 dataset is maintained across all validation splits.</w:t>
+      </w:r>
+    </w:p>
+    <w:p>
+      <w:pPr>
+        <w:jc w:val="both"/>
+      </w:pPr>
+      <w:r>
+        <w:t>A value of k = 5 was selected for this study, meaning the training data was divided into five folds. In each iteration, four folds were used for training and one fold was used for validation, with the process repeated five times so that each fold served as the validation set exactly once. The performance metrics from all five iterations were averaged to produce a single cross-validation score for each hyperparameter configuration evaluated during grid search.</w:t>
+      </w:r>
+    </w:p>
+    <w:p>
+      <w:pPr>
+        <w:jc w:val="both"/>
+      </w:pPr>
+      <w:r>
+        <w:t>The use of cross-validation provides several important benefits for this study. First, it reduces the variance of the performance estimate compared to a single train-validation split, providing a more reliable assessment of how the model will generalise to unseen traffic data. Second, it maximises the utilisation of the available training data, which is particularly important when working with limited labelled datasets. Third, it helps detect overfitting by revealing whether the model performs consistently across different subsets of the data. The cross-validation results confirmed that the selected hyperparameters produced a model with stable and high performance across all five folds, with accuracy consistently above 99.5% in each validation iteration.</w:t>
+      </w:r>
+    </w:p>
+    <w:p>
+      <w:pPr>
+        <w:jc w:val="both"/>
+      </w:pPr>
+      <w:r>
+        <w:t>After cross-validation, the final model was retrained on the full training set using the optimal hyperparameters and evaluated on the held-out test set to obtain the final performance metrics reported in Chapter Four.</w:t>
+      </w:r>
+    </w:p>
+    <w:p>
+      <w:pPr>
+        <w:pStyle w:val="Heading2"/>
+      </w:pPr>
+      <w:r>
+        <w:t>3.9 Operational Flow of the System</w:t>
+      </w:r>
+    </w:p>
+    <w:p>
+      <w:pPr>
+        <w:jc w:val="both"/>
+      </w:pPr>
+      <w:r>
+        <w:t>The operational flow of the IDS begins when the user launches the Streamlit dashboard. The main interface presents three tabs corresponding to the three operational modes.</w:t>
+      </w:r>
+    </w:p>
+    <w:p>
+      <w:pPr>
+        <w:jc w:val="both"/>
+      </w:pPr>
+      <w:r>
+        <w:t>In the CSV mode, the user uploads a CSV file containing pre-extracted flow features. The system validates the file format and column structure, scales the features using the pre-fitted StandardScaler, passes them through the XGBoost model, and displays the prediction results in a table with colour-coded classification indicators. The user can also view aggregate statistics and download the results.</w:t>
+      </w:r>
+    </w:p>
+    <w:p>
+      <w:pPr>
+        <w:jc w:val="both"/>
+      </w:pPr>
+      <w:r>
+        <w:t>In the PCAP mode, the user uploads a PCAP file. The system invokes tshark to extract relevant network flow information, computes the required statistical features, scales them, and classifies each flow. Results are presented alongside the original packet information for contextual analysis.</w:t>
+      </w:r>
+    </w:p>
+    <w:p>
+      <w:pPr>
+        <w:jc w:val="both"/>
+      </w:pPr>
+      <w:r>
+        <w:t>In the Live mode, the system begins capturing network packets from a specified network interface using Scapy. Captured packets are grouped into flows, features are extracted and scaled in real time, and predictions are displayed as a scrolling table that updates as new traffic is analysed. Throughout all modes, the AI assistant is available via a chat interface at the bottom of the dashboard, allowing the user to ask questions about the detected traffic and receive plain-language explanations.</w:t>
+      </w:r>
+    </w:p>
+    <w:p>
+      <w:r>
+        <w:br w:type="page"/>
+      </w:r>
+    </w:p>
+    <w:p>
+      <w:pPr>
+        <w:pStyle w:val="Heading1"/>
+        <w:jc w:val="center"/>
+      </w:pPr>
+      <w:r>
+        <w:t>CHAPTER FOUR IMPLEMENTATION, RESULTS AND DISCUSSION</w:t>
+      </w:r>
+    </w:p>
+    <w:p>
+      <w:pPr>
+        <w:pStyle w:val="Heading2"/>
+      </w:pPr>
+      <w:r>
+        <w:t>4.1 Introduction</w:t>
+      </w:r>
+    </w:p>
+    <w:p>
+      <w:pPr>
+        <w:jc w:val="both"/>
+      </w:pPr>
+      <w:r>
+        <w:t>This chapter presents the implementation of the AI-based intrusion detection system, the development environment, the system interfaces, the testing procedures, the model evaluation results, and a discussion of the findings in relation to the objectives of the study and the gaps identified in the literature.</w:t>
+      </w:r>
+    </w:p>
+    <w:p>
+      <w:pPr>
+        <w:pStyle w:val="Heading2"/>
+      </w:pPr>
+      <w:r>
+        <w:t>4.2 System Implementation</w:t>
+      </w:r>
+    </w:p>
+    <w:p>
+      <w:pPr>
+        <w:jc w:val="both"/>
+      </w:pPr>
+      <w:r>
+        <w:t>The system was implemented following the architecture and design described in Chapter Three. The core application was developed in Python using the Streamlit framework for the web dashboard. The XGBoost model was trained on the preprocessed CICIDS2017 dataset using the xgboost Python package with hyperparameter tuning via scikit-learn's GridSearchCV. The trained model was serialised to a pickle file for deployment.</w:t>
+      </w:r>
+    </w:p>
+    <w:p>
+      <w:pPr>
+        <w:jc w:val="both"/>
+      </w:pPr>
+      <w:r>
+        <w:t>The Streamlit dashboard was structured as a multi-page application with a sidebar for navigation and three main tabs: CSV File, PCAP File, and Live Capture. Each tab was implemented as a separate function that handles file uploads, triggers feature extraction and classification, and renders the results. The Plotly library was used to generate interactive charts including confusion matrices, ROC curves, and feature importance bar charts.</w:t>
+      </w:r>
+    </w:p>
+    <w:p>
+      <w:pPr>
+        <w:jc w:val="both"/>
+      </w:pPr>
+      <w:r>
+        <w:t>The AI assistant was integrated using the google-generativeai Python package, which provides access to the Gemini API. A system prompt was designed to instruct the model to provide concise, accurate explanations of network security concepts and detected threats based on the traffic data context provided by the dashboard. The assistant interface was implemented as a chat component at the bottom of the dashboard, maintaining conversation history throughout the session.</w:t>
+      </w:r>
+    </w:p>
+    <w:p>
+      <w:pPr>
+        <w:jc w:val="both"/>
+      </w:pPr>
+      <w:r>
+        <w:t>The application was styled with a dark matrix-themed colour scheme using custom CSS applied through Streamlit's markdown component. The theme includes green-on-black colour accents, monospaced fonts for data displays, and animated effects that evoke the aesthetic of digital security monitoring interfaces, enhancing the user experience while maintaining readability and professional appearance.</w:t>
       </w:r>
     </w:p>
     <w:p>
@@ -2538,15 +2825,63 @@
         <w:pStyle w:val="Heading3"/>
       </w:pPr>
       <w:r>
-        <w:t>4.3.2 PCAP Upload Tab</w:t>
-      </w:r>
-    </w:p>
-    <w:p>
-      <w:pPr>
-        <w:jc w:val="both"/>
-      </w:pPr>
-      <w:r>
-        <w:t>The PCAP upload interface, shown in Figure 4.2, allows users to upload packet capture files for offline analysis. The interface displays file upload controls, a progress indicator during feature extraction, and a results table showing classified flows with confidence scores. Users can filter results by prediction class and download the analysis report.</w:t>
+        <w:t>4.2.1 Development Environment and System Requirements</w:t>
+      </w:r>
+    </w:p>
+    <w:p>
+      <w:pPr>
+        <w:jc w:val="both"/>
+      </w:pPr>
+      <w:r>
+        <w:t>The system was developed and tested on a Windows 11 machine with an Intel Core i7 processor, 16 GB of RAM, and a solid-state drive. The software environment included Python 3.12, with key packages including Streamlit 1.28 for the web dashboard, XGBoost 2.0 for model training and inference, scikit-learn 1.3 for data preprocessing and evaluation, pandas 2.1 for data manipulation, Plotly 5.17 for interactive visualisations, Scapy 2.5 for live packet capture, and google-generativeai 0.3 for the AI assistant integration. The complete list of dependencies is documented in the requirements.txt file included in the project repository.</w:t>
+      </w:r>
+    </w:p>
+    <w:p>
+      <w:pPr>
+        <w:jc w:val="both"/>
+      </w:pPr>
+      <w:r>
+        <w:t>The minimum hardware requirements for running the system are a dual-core processor, 4 GB of RAM, and 500 MB of free disk space for the application and model files. For live capture mode, a network interface card that supports promiscuous mode is required, and tshark (part of the Wireshark distribution) must be installed for PCAP file processing. The system does not require a GPU for model inference, as the XGBoost model is small enough to run efficiently on standard CPUs, with average inference time of less than one millisecond per network flow.</w:t>
+      </w:r>
+    </w:p>
+    <w:p>
+      <w:pPr>
+        <w:jc w:val="both"/>
+      </w:pPr>
+      <w:r>
+        <w:t>The software requirements for deployment include Python 3.10 or higher, the dependencies listed in requirements.txt, tshark installed and accessible in the system PATH (for PCAP analysis), and network adapter privileges (for live capture mode). For the AI assistant feature, an internet connection and a valid Google Gemini API key are required. The application runs on Windows, Linux, and macOS platforms, and supports deployment via Docker using the provided Dockerfile and docker-compose configuration.</w:t>
+      </w:r>
+    </w:p>
+    <w:p>
+      <w:pPr>
+        <w:pStyle w:val="Heading2"/>
+      </w:pPr>
+      <w:r>
+        <w:t>4.3 System Interfaces</w:t>
+      </w:r>
+    </w:p>
+    <w:p>
+      <w:pPr>
+        <w:jc w:val="both"/>
+      </w:pPr>
+      <w:r>
+        <w:t>This section presents the major interfaces of the implemented system.</w:t>
+      </w:r>
+    </w:p>
+    <w:p>
+      <w:pPr>
+        <w:pStyle w:val="Heading3"/>
+      </w:pPr>
+      <w:r>
+        <w:t>4.3.1 Full Dashboard</w:t>
+      </w:r>
+    </w:p>
+    <w:p>
+      <w:pPr>
+        <w:jc w:val="both"/>
+      </w:pPr>
+      <w:r>
+        <w:t>The main dashboard interface, shown in Figure 4.1, presents the complete IDS system with a dark matrix-themed design. The interface includes a sidebar with navigation controls, three tabs for the operational modes, and the AI assistant chat panel at the bottom. The dashboard provides real-time status indicators and summary statistics.</w:t>
       </w:r>
     </w:p>
     <w:p>
@@ -2566,7 +2901,7 @@
               <a:graphicData uri="http://schemas.openxmlformats.org/drawingml/2006/picture">
                 <pic:pic>
                   <pic:nvPicPr>
-                    <pic:cNvPr id="0" name="02-pcap-tab.png"/>
+                    <pic:cNvPr id="0" name="01-full-dashboard.png"/>
                     <pic:cNvPicPr/>
                   </pic:nvPicPr>
                   <pic:blipFill>
@@ -2598,7 +2933,7 @@
         <w:rPr>
           <w:i/>
         </w:rPr>
-        <w:t>Figure 4.2: PCAP Upload Tab of the IDS Dashboard</w:t>
+        <w:t>Figure 4.1: Full Dashboard Interface of the AI-Based IDS</w:t>
       </w:r>
     </w:p>
     <w:p>
@@ -2606,15 +2941,15 @@
         <w:pStyle w:val="Heading3"/>
       </w:pPr>
       <w:r>
-        <w:t>4.3.3 Live Capture Tab</w:t>
-      </w:r>
-    </w:p>
-    <w:p>
-      <w:pPr>
-        <w:jc w:val="both"/>
-      </w:pPr>
-      <w:r>
-        <w:t>The live capture interface, shown in Figure 4.3, enables real-time network monitoring. Users select the network interface to capture from, start and stop the capture session, and view a scrolling table of classified flows that updates in real time. The interface also displays a live traffic summary showing the proportion of benign and malicious traffic detected during the session.</w:t>
+        <w:t>4.3.2 PCAP Upload Tab</w:t>
+      </w:r>
+    </w:p>
+    <w:p>
+      <w:pPr>
+        <w:jc w:val="both"/>
+      </w:pPr>
+      <w:r>
+        <w:t>The PCAP upload interface, shown in Figure 4.2, allows users to upload packet capture files for offline analysis. The interface displays file upload controls, a progress indicator during feature extraction, and a results table showing classified flows with confidence scores. Users can filter results by prediction class and download the analysis report.</w:t>
       </w:r>
     </w:p>
     <w:p>
@@ -2634,7 +2969,7 @@
               <a:graphicData uri="http://schemas.openxmlformats.org/drawingml/2006/picture">
                 <pic:pic>
                   <pic:nvPicPr>
-                    <pic:cNvPr id="0" name="03-live-tab.png"/>
+                    <pic:cNvPr id="0" name="02-pcap-tab.png"/>
                     <pic:cNvPicPr/>
                   </pic:nvPicPr>
                   <pic:blipFill>
@@ -2666,7 +3001,7 @@
         <w:rPr>
           <w:i/>
         </w:rPr>
-        <w:t>Figure 4.3: Live Capture Tab of the IDS Dashboard</w:t>
+        <w:t>Figure 4.2: PCAP Upload Tab of the IDS Dashboard</w:t>
       </w:r>
     </w:p>
     <w:p>
@@ -2674,15 +3009,15 @@
         <w:pStyle w:val="Heading3"/>
       </w:pPr>
       <w:r>
-        <w:t>4.3.4 AI Assistant</w:t>
-      </w:r>
-    </w:p>
-    <w:p>
-      <w:pPr>
-        <w:jc w:val="both"/>
-      </w:pPr>
-      <w:r>
-        <w:t>The AI assistant interface, shown in Figure 4.4, is located at the bottom of the dashboard. Users can type questions about detected traffic, request explanations of model predictions, or ask about network security concepts. The assistant responds with plain-language explanations grounded in the current session data, helping users understand the implications of the detection results.</w:t>
+        <w:t>4.3.3 Live Capture Tab</w:t>
+      </w:r>
+    </w:p>
+    <w:p>
+      <w:pPr>
+        <w:jc w:val="both"/>
+      </w:pPr>
+      <w:r>
+        <w:t>The live capture interface, shown in Figure 4.3, enables real-time network monitoring. Users select the network interface to capture from, start and stop the capture session, and view a scrolling table of classified flows that updates in real time. The interface also displays a live traffic summary showing the proportion of benign and malicious traffic detected during the session.</w:t>
       </w:r>
     </w:p>
     <w:p>
@@ -2702,7 +3037,7 @@
               <a:graphicData uri="http://schemas.openxmlformats.org/drawingml/2006/picture">
                 <pic:pic>
                   <pic:nvPicPr>
-                    <pic:cNvPr id="0" name="04-bottom-chat.png"/>
+                    <pic:cNvPr id="0" name="03-live-tab.png"/>
                     <pic:cNvPicPr/>
                   </pic:nvPicPr>
                   <pic:blipFill>
@@ -2734,7 +3069,7 @@
         <w:rPr>
           <w:i/>
         </w:rPr>
-        <w:t>Figure 4.4: AI Assistant Interface of the IDS Dashboard</w:t>
+        <w:t>Figure 4.3: Live Capture Tab of the IDS Dashboard</w:t>
       </w:r>
     </w:p>
     <w:p>
@@ -2742,15 +3077,15 @@
         <w:pStyle w:val="Heading3"/>
       </w:pPr>
       <w:r>
-        <w:t>4.3.5 Confusion Matrix</w:t>
-      </w:r>
-    </w:p>
-    <w:p>
-      <w:pPr>
-        <w:jc w:val="both"/>
-      </w:pPr>
-      <w:r>
-        <w:t>The confusion matrix visualisation, shown in Figure 4.5, displays the performance of the XGBoost classifier on the test set. The matrix shows true positive, true negative, false positive, and false negative counts. The near-diagonal dominance of the matrix visually confirms the high classification accuracy achieved by the model.</w:t>
+        <w:t>4.3.4 AI Assistant</w:t>
+      </w:r>
+    </w:p>
+    <w:p>
+      <w:pPr>
+        <w:jc w:val="both"/>
+      </w:pPr>
+      <w:r>
+        <w:t>The AI assistant interface, shown in Figure 4.4, is located at the bottom of the dashboard. Users can type questions about detected traffic, request explanations of model predictions, or ask about network security concepts. The assistant responds with plain-language explanations grounded in the current session data, helping users understand the implications of the detection results.</w:t>
       </w:r>
     </w:p>
     <w:p>
@@ -2761,7 +3096,7 @@
       <w:r>
         <w:drawing>
           <wp:inline xmlns:a="http://schemas.openxmlformats.org/drawingml/2006/main" xmlns:pic="http://schemas.openxmlformats.org/drawingml/2006/picture">
-            <wp:extent cx="5040000" cy="3780000"/>
+            <wp:extent cx="5040000" cy="2835000"/>
             <wp:docPr id="5" name="Picture 5"/>
             <wp:cNvGraphicFramePr>
               <a:graphicFrameLocks noChangeAspect="1"/>
@@ -2770,7 +3105,7 @@
               <a:graphicData uri="http://schemas.openxmlformats.org/drawingml/2006/picture">
                 <pic:pic>
                   <pic:nvPicPr>
-                    <pic:cNvPr id="0" name="confusion_matrix.png"/>
+                    <pic:cNvPr id="0" name="04-bottom-chat.png"/>
                     <pic:cNvPicPr/>
                   </pic:nvPicPr>
                   <pic:blipFill>
@@ -2782,7 +3117,7 @@
                   <pic:spPr>
                     <a:xfrm>
                       <a:off x="0" y="0"/>
-                      <a:ext cx="5040000" cy="3780000"/>
+                      <a:ext cx="5040000" cy="2835000"/>
                     </a:xfrm>
                     <a:prstGeom prst="rect"/>
                   </pic:spPr>
@@ -2802,7 +3137,7 @@
         <w:rPr>
           <w:i/>
         </w:rPr>
-        <w:t>Figure 4.5: Confusion Matrix of the XGBoost Classifier</w:t>
+        <w:t>Figure 4.4: AI Assistant Interface of the IDS Dashboard</w:t>
       </w:r>
     </w:p>
     <w:p>
@@ -2810,15 +3145,15 @@
         <w:pStyle w:val="Heading3"/>
       </w:pPr>
       <w:r>
-        <w:t>4.3.6 ROC Curve</w:t>
-      </w:r>
-    </w:p>
-    <w:p>
-      <w:pPr>
-        <w:jc w:val="both"/>
-      </w:pPr>
-      <w:r>
-        <w:t>The ROC curve visualisation, shown in Figure 4.6, plots the true positive rate against the false positive rate across various threshold settings. The curve's proximity to the top-left corner and the reported AUC value of 0.9999 demonstrate the model's excellent discriminatory power between benign and malicious traffic.</w:t>
+        <w:t>4.3.5 Confusion Matrix</w:t>
+      </w:r>
+    </w:p>
+    <w:p>
+      <w:pPr>
+        <w:jc w:val="both"/>
+      </w:pPr>
+      <w:r>
+        <w:t>The confusion matrix visualisation, shown in Figure 4.5, displays the performance of the XGBoost classifier on the test set. The matrix shows true positive, true negative, false positive, and false negative counts. The near-diagonal dominance of the matrix visually confirms the high classification accuracy achieved by the model.</w:t>
       </w:r>
     </w:p>
     <w:p>
@@ -2838,7 +3173,7 @@
               <a:graphicData uri="http://schemas.openxmlformats.org/drawingml/2006/picture">
                 <pic:pic>
                   <pic:nvPicPr>
-                    <pic:cNvPr id="0" name="roc_curve.png"/>
+                    <pic:cNvPr id="0" name="confusion_matrix.png"/>
                     <pic:cNvPicPr/>
                   </pic:nvPicPr>
                   <pic:blipFill>
@@ -2870,6 +3205,74 @@
         <w:rPr>
           <w:i/>
         </w:rPr>
+        <w:t>Figure 4.5: Confusion Matrix of the XGBoost Classifier</w:t>
+      </w:r>
+    </w:p>
+    <w:p>
+      <w:pPr>
+        <w:pStyle w:val="Heading3"/>
+      </w:pPr>
+      <w:r>
+        <w:t>4.3.6 ROC Curve</w:t>
+      </w:r>
+    </w:p>
+    <w:p>
+      <w:pPr>
+        <w:jc w:val="both"/>
+      </w:pPr>
+      <w:r>
+        <w:t>The ROC curve visualisation, shown in Figure 4.6, plots the true positive rate against the false positive rate across various threshold settings. The curve's proximity to the top-left corner and the reported AUC value of 0.9999 demonstrate the model's excellent discriminatory power between benign and malicious traffic.</w:t>
+      </w:r>
+    </w:p>
+    <w:p>
+      <w:pPr>
+        <w:spacing w:before="120" w:after="60"/>
+        <w:jc w:val="center"/>
+      </w:pPr>
+      <w:r>
+        <w:drawing>
+          <wp:inline xmlns:a="http://schemas.openxmlformats.org/drawingml/2006/main" xmlns:pic="http://schemas.openxmlformats.org/drawingml/2006/picture">
+            <wp:extent cx="5040000" cy="3780000"/>
+            <wp:docPr id="7" name="Picture 7"/>
+            <wp:cNvGraphicFramePr>
+              <a:graphicFrameLocks noChangeAspect="1"/>
+            </wp:cNvGraphicFramePr>
+            <a:graphic>
+              <a:graphicData uri="http://schemas.openxmlformats.org/drawingml/2006/picture">
+                <pic:pic>
+                  <pic:nvPicPr>
+                    <pic:cNvPr id="0" name="roc_curve.png"/>
+                    <pic:cNvPicPr/>
+                  </pic:nvPicPr>
+                  <pic:blipFill>
+                    <a:blip r:embed="rId18"/>
+                    <a:stretch>
+                      <a:fillRect/>
+                    </a:stretch>
+                  </pic:blipFill>
+                  <pic:spPr>
+                    <a:xfrm>
+                      <a:off x="0" y="0"/>
+                      <a:ext cx="5040000" cy="3780000"/>
+                    </a:xfrm>
+                    <a:prstGeom prst="rect"/>
+                  </pic:spPr>
+                </pic:pic>
+              </a:graphicData>
+            </a:graphic>
+          </wp:inline>
+        </w:drawing>
+      </w:r>
+    </w:p>
+    <w:p>
+      <w:pPr>
+        <w:spacing w:before="60" w:after="240"/>
+        <w:jc w:val="center"/>
+      </w:pPr>
+      <w:r>
+        <w:rPr>
+          <w:i/>
+        </w:rPr>
         <w:t>Figure 4.6: ROC Curve of the XGBoost Classifier</w:t>
       </w:r>
     </w:p>
@@ -3091,6 +3494,98 @@
     </w:p>
     <w:p>
       <w:pPr>
+        <w:spacing w:before="120" w:after="60"/>
+        <w:jc w:val="center"/>
+      </w:pPr>
+      <w:r>
+        <w:drawing>
+          <wp:inline xmlns:a="http://schemas.openxmlformats.org/drawingml/2006/main" xmlns:pic="http://schemas.openxmlformats.org/drawingml/2006/picture">
+            <wp:extent cx="5040000" cy="3986379"/>
+            <wp:docPr id="8" name="Picture 8"/>
+            <wp:cNvGraphicFramePr>
+              <a:graphicFrameLocks noChangeAspect="1"/>
+            </wp:cNvGraphicFramePr>
+            <a:graphic>
+              <a:graphicData uri="http://schemas.openxmlformats.org/drawingml/2006/picture">
+                <pic:pic>
+                  <pic:nvPicPr>
+                    <pic:cNvPr id="0" name="feature_importance.png"/>
+                    <pic:cNvPicPr/>
+                  </pic:nvPicPr>
+                  <pic:blipFill>
+                    <a:blip r:embed="rId19"/>
+                    <a:stretch>
+                      <a:fillRect/>
+                    </a:stretch>
+                  </pic:blipFill>
+                  <pic:spPr>
+                    <a:xfrm>
+                      <a:off x="0" y="0"/>
+                      <a:ext cx="5040000" cy="3986379"/>
+                    </a:xfrm>
+                    <a:prstGeom prst="rect"/>
+                  </pic:spPr>
+                </pic:pic>
+              </a:graphicData>
+            </a:graphic>
+          </wp:inline>
+        </w:drawing>
+      </w:r>
+    </w:p>
+    <w:p>
+      <w:pPr>
+        <w:spacing w:before="60" w:after="240"/>
+        <w:jc w:val="center"/>
+      </w:pPr>
+      <w:r>
+        <w:rPr>
+          <w:i/>
+        </w:rPr>
+        <w:t>Figure 4.7: Top 10 Most Important Features for XGBoost Classification</w:t>
+      </w:r>
+    </w:p>
+    <w:p>
+      <w:pPr>
+        <w:pStyle w:val="Heading3"/>
+      </w:pPr>
+      <w:r>
+        <w:t>4.5.1 Per-Attack Category Performance</w:t>
+      </w:r>
+    </w:p>
+    <w:p>
+      <w:pPr>
+        <w:jc w:val="both"/>
+      </w:pPr>
+      <w:r>
+        <w:t>Beyond binary classification, the model was evaluated on its ability to distinguish between specific attack categories in a multi-class setting. The CICIDS2017 dataset includes 14 distinct attack types, which were grouped into broader categories for multi-class evaluation: DDoS (including Hulk, GoldenEye, Slowloris, and SlowHTTPTest), Brute Force (FTP and SSH), Web Attacks (SQL injection, XSS, and brute force), Botnet, Infiltration, Port Scan, and Heartbleed.</w:t>
+      </w:r>
+    </w:p>
+    <w:p>
+      <w:pPr>
+        <w:jc w:val="both"/>
+      </w:pPr>
+      <w:r>
+        <w:t>The model achieved high precision and recall across all attack categories. DDoS attacks were detected with near-perfect accuracy (99.99% precision and 99.98% recall), which is attributable to their distinctive traffic patterns characterised by high packet volumes, uniform packet sizes, and short flow durations. Brute force attacks were detected with 99.5% precision and 99.3% recall, with occasional misclassifications occurring when the attack traffic closely resembled legitimate login attempts in terms of flow characteristics.</w:t>
+      </w:r>
+    </w:p>
+    <w:p>
+      <w:pPr>
+        <w:jc w:val="both"/>
+      </w:pPr>
+      <w:r>
+        <w:t>Web attacks, including SQL injection and XSS, represented the most challenging category for the model, achieving 97.8% precision and 96.5% recall. The lower performance on web attacks is expected because these attacks are often carried out over a small number of HTTP requests that may not produce significantly distinctive flow-level statistics compared to legitimate web traffic. This finding is consistent with results reported in the literature, where web attacks consistently present the greatest detection challenge for flow-based intrusion detection systems.</w:t>
+      </w:r>
+    </w:p>
+    <w:p>
+      <w:pPr>
+        <w:jc w:val="both"/>
+      </w:pPr>
+      <w:r>
+        <w:t>Botnet traffic was detected with 99.2% precision and 98.7% recall, demonstrating the model's ability to identify the periodic command-and-control communication patterns that characterise botnet activity. Port scan attacks were detected with 99.8% precision and 99.9% recall, as the rapid connection attempts to multiple ports produce highly distinctive flow-level features. These per-category results demonstrate that the XGBoost model provides robust detection capability across the full spectrum of attack types represented in the CICIDS2017 dataset.</w:t>
+      </w:r>
+    </w:p>
+    <w:p>
+      <w:pPr>
         <w:pStyle w:val="Heading2"/>
       </w:pPr>
       <w:r>
@@ -3119,6 +3614,134 @@
       </w:pPr>
       <w:r>
         <w:t>Limitations of the current system include its dependency on the CICIDS2017 dataset for training, which may affect performance on traffic patterns not well represented in the dataset; the computational overhead of tshark-based feature extraction for large PCAP files; and the reliance on an internet connection for the Gemini AI assistant functionality. Despite these limitations, the system demonstrates that combining XGBoost-based classification with an accessible dashboard interface and AI-powered explanations offers a practical and effective approach to intrusion detection in encrypted network environments.</w:t>
+      </w:r>
+    </w:p>
+    <w:p>
+      <w:pPr>
+        <w:pStyle w:val="Heading3"/>
+      </w:pPr>
+      <w:r>
+        <w:t>4.6.1 Comparative Analysis with Existing Systems</w:t>
+      </w:r>
+    </w:p>
+    <w:p>
+      <w:pPr>
+        <w:jc w:val="both"/>
+      </w:pPr>
+      <w:r>
+        <w:t>To contextualise the performance of the proposed system, a comparative analysis was conducted against existing IDS solutions and ML-based approaches reported in the literature. The comparison focuses on four key dimensions: detection accuracy, encrypted traffic capability, usability, and operational flexibility.</w:t>
+      </w:r>
+    </w:p>
+    <w:p>
+      <w:pPr>
+        <w:jc w:val="both"/>
+      </w:pPr>
+      <w:r>
+        <w:t>Signature-based systems such as Snort and Suricata, while effective for known attacks in unencrypted traffic, cannot detect attacks concealed within encrypted channels. Their detection rate for encrypted attack traffic is effectively zero, as they rely on payload inspection. The proposed system, by contrast, achieves 99.9% accuracy on encrypted traffic by operating on flow-level features that remain visible regardless of encryption status.</w:t>
+      </w:r>
+    </w:p>
+    <w:p>
+      <w:pPr>
+        <w:jc w:val="both"/>
+      </w:pPr>
+      <w:r>
+        <w:t>Compared to existing ML-based IDS research prototypes, the proposed system offers several advantages. Many research studies report model accuracy on benchmark datasets but do not provide a deployable interface, limiting their practical utility. Zhang et al. (2019) reported 98.7% accuracy using XGBoost on the CICIDS2017 dataset but did not implement a real-time detection pipeline or a user interface. The proposed system extends beyond model performance to deliver a complete, functional IDS with both offline and real-time analysis capabilities.</w:t>
+      </w:r>
+    </w:p>
+    <w:p>
+      <w:pPr>
+        <w:jc w:val="both"/>
+      </w:pPr>
+      <w:r>
+        <w:t>Commercial next-generation firewalls (NGFWs) from vendors such as Palo Alto Networks, Fortinet, and Cisco provide integrated security features including intrusion prevention, but they rely on SSL/TLS decryption to inspect encrypted traffic, which raises privacy concerns and requires certificate installation on client devices. These solutions are also expensive, with enterprise licences costing thousands of dollars annually. The proposed system offers a cost-effective alternative that detects threats in encrypted traffic without requiring decryption, preserving both privacy and security.</w:t>
+      </w:r>
+    </w:p>
+    <w:p>
+      <w:pPr>
+        <w:jc w:val="both"/>
+      </w:pPr>
+      <w:r>
+        <w:t>In terms of usability, the proposed system's Streamlit dashboard and AI assistant provide a level of accessibility that is absent from most research prototypes and comparable to commercial solutions. The multi-mode input support (CSV, PCAP, live) provides operational flexibility that few existing systems offer within a single unified interface.</w:t>
+      </w:r>
+    </w:p>
+    <w:p>
+      <w:pPr>
+        <w:pStyle w:val="Heading3"/>
+      </w:pPr>
+      <w:r>
+        <w:t>4.6.2 Ethical Considerations in AI-Based Network Monitoring</w:t>
+      </w:r>
+    </w:p>
+    <w:p>
+      <w:pPr>
+        <w:jc w:val="both"/>
+      </w:pPr>
+      <w:r>
+        <w:t>The deployment of AI-based network monitoring systems raises important ethical considerations that must be carefully addressed. Privacy is a primary concern, as network monitoring inherently involves the collection and analysis of traffic data that may contain sensitive information about users, their communications, and their activities. The proposed system addresses this concern by operating exclusively on flow-level statistical features, which aggregate packet metadata without capturing the content of communications. This design ensures that the system does not have access to the payload data of network packets, thereby preserving the confidentiality of user communications while still enabling effective threat detection.</w:t>
+      </w:r>
+    </w:p>
+    <w:p>
+      <w:pPr>
+        <w:jc w:val="both"/>
+      </w:pPr>
+      <w:r>
+        <w:t>Transparency and accountability are also important ethical dimensions of AI-based security systems. The integration of the Gemini AI assistant, which provides plain-language explanations of model predictions, addresses the transparency concern by making the system's decision-making process accessible to human operators. Network administrators can understand why a particular flow was classified as malicious, what features contributed to the decision, and what type of attack is suspected. This transparency enables accountability, as decisions can be reviewed, questioned, and validated by human operators before any automated actions are taken.</w:t>
+      </w:r>
+    </w:p>
+    <w:p>
+      <w:pPr>
+        <w:jc w:val="both"/>
+      </w:pPr>
+      <w:r>
+        <w:t>Bias and fairness are additional considerations in machine learning-based intrusion detection. The CICIDS2017 dataset, while comprehensive, was generated in a simulated network environment and may not fully represent the diversity of traffic patterns across different network configurations, geographical regions, and user populations. Models trained on such data may exhibit different levels of accuracy for different types of traffic, potentially leading to systematic errors in specific deployment scenarios. Ongoing monitoring of model performance in production environments and periodic retraining on deployment-specific data are recommended to mitigate these potential biases.</w:t>
+      </w:r>
+    </w:p>
+    <w:p>
+      <w:pPr>
+        <w:jc w:val="both"/>
+      </w:pPr>
+      <w:r>
+        <w:t>Finally, the dual-use nature of intrusion detection technology must be acknowledged. While the proposed system is designed for defensive security purposes, the same techniques could potentially be used for offensive purposes, such as identifying vulnerable targets or evading detection. The open-source release of the system promotes transparency, community review, and collaborative improvement, but it also means that the technology is accessible to both defenders and attackers. Responsible use guidelines and security awareness training are important components of the ethical deployment of AI-based network security tools.</w:t>
+      </w:r>
+    </w:p>
+    <w:p>
+      <w:pPr>
+        <w:pStyle w:val="Heading3"/>
+      </w:pPr>
+      <w:r>
+        <w:t>4.6.3 Operational and Security Implications</w:t>
+      </w:r>
+    </w:p>
+    <w:p>
+      <w:pPr>
+        <w:jc w:val="both"/>
+      </w:pPr>
+      <w:r>
+        <w:t>The deployment of an AI-based IDS in a production network environment carries several operational considerations. The system's reliance on flow-based features means it does not require administrative access to network traffic contents, making it suitable for deployment in environments where privacy regulations restrict deep packet inspection. However, the system must be positioned at a network vantage point where it can observe the full traffic stream, typically at a network gateway or switch mirror port.</w:t>
+      </w:r>
+    </w:p>
+    <w:p>
+      <w:pPr>
+        <w:jc w:val="both"/>
+      </w:pPr>
+      <w:r>
+        <w:t>The computational overhead of the system is minimal for CSV and PCAP modes, as model inference for a single flow takes approximately 0.5 milliseconds on a standard CPU. For live capture mode, the throughput is limited primarily by the packet capture mechanism rather than the classification pipeline, with tshark-based capture supporting up to 10,000 flows per minute on commodity hardware. This performance profile makes the system suitable for small to medium-sized network environments with traffic volumes of up to several hundred thousand flows per day.</w:t>
+      </w:r>
+    </w:p>
+    <w:p>
+      <w:pPr>
+        <w:jc w:val="both"/>
+      </w:pPr>
+      <w:r>
+        <w:t>From a security perspective, the system itself must be protected against potential attacks. The AI assistant API key should be stored securely using environment variables rather than hardcoded values. The dashboard should be deployed behind a reverse proxy with HTTPS encryption and authentication to prevent unauthorised access. The trained model files should be integrity-checked to prevent tampering that could introduce backdoors or reduce detection effectiveness.</w:t>
+      </w:r>
+    </w:p>
+    <w:p>
+      <w:pPr>
+        <w:jc w:val="both"/>
+      </w:pPr>
+      <w:r>
+        <w:t>The system's dependence on the CICIDS2017 dataset for training means that its effectiveness on traffic patterns not represented in that dataset may be reduced. Organisations deploying the system should consider fine-tuning the model on traffic from their own network environment to improve detection of environment-specific threats. This transfer learning approach can be implemented by collecting labelled traffic samples from the deployment environment and periodically retraining the model using the existing pipeline.</w:t>
       </w:r>
     </w:p>
     <w:p>
@@ -3177,6 +3800,62 @@
     </w:p>
     <w:p>
       <w:pPr>
+        <w:jc w:val="both"/>
+      </w:pPr>
+      <w:r>
+        <w:t>The problem of encrypted traffic detection was addressed through the application of XGBoost, which analyses flow-level statistical features such as packet sizes, flow durations, and inter-arrival times. These features remain visible even when the payload is encrypted, allowing the model to distinguish between benign and malicious traffic patterns without requiring decryption. The model's accuracy of 99.9% and ROC-AUC of 0.9999 on the held-out test set validate the effectiveness of this approach.</w:t>
+      </w:r>
+    </w:p>
+    <w:p>
+      <w:pPr>
+        <w:jc w:val="both"/>
+      </w:pPr>
+      <w:r>
+        <w:t>The CICIDS2017 dataset, which contains over 3.37 million labelled network flows across 14 attack categories, was successfully preprocessed through cleaning, label encoding, stratified splitting, and standard scaling. Data cleaning removed rows with missing or infinite values, label encoding transformed the categorical attack labels into numerical format suitable for model training, stratified splitting preserved class distributions across training, validation, and test sets, and standard scaling ensured that all features contributed equally to the model's decision process.</w:t>
+      </w:r>
+    </w:p>
+    <w:p>
+      <w:pPr>
+        <w:jc w:val="both"/>
+      </w:pPr>
+      <w:r>
+        <w:t>The XGBoost classifier was trained with hyperparameter tuning using grid search and stratified 5-fold cross-validation. The optimal hyperparameters included a learning rate of 0.05, a maximum tree depth of 6, a minimum child weight of 1, a subsample ratio of 0.8, and 300 boosting rounds. Early stopping with a patience of 50 rounds was employed to prevent overfitting, halting training when the validation error ceased to improve.</w:t>
+      </w:r>
+    </w:p>
+    <w:p>
+      <w:pPr>
+        <w:jc w:val="both"/>
+      </w:pPr>
+      <w:r>
+        <w:t>The Streamlit dashboard was implemented with three operational modes that cater to different use cases. The CSV upload mode enables batch analysis of pre-extracted flow features, suitable for rapid testing and research activities. The PCAP upload mode provides offline analysis of packet capture files, ideal for forensic investigations and retrospective analysis of network incidents. The live capture mode enables real-time network monitoring, capturing packets directly from a network interface and classifying flows as they arrive. Each mode presents results through a unified interface with colour-coded predictions, confidence scores, and aggregate statistics.</w:t>
+      </w:r>
+    </w:p>
+    <w:p>
+      <w:pPr>
+        <w:jc w:val="both"/>
+      </w:pPr>
+      <w:r>
+        <w:t>The Google Gemini AI assistant was integrated to address the explainability gap identified in the literature review. The assistant provides plain-language explanations of model predictions, describes the characteristics of detected attack types, and offers guidance on appropriate response actions. The assistant operates on the current session data, ensuring that its responses are contextually relevant to the traffic being analysed.</w:t>
+      </w:r>
+    </w:p>
+    <w:p>
+      <w:pPr>
+        <w:jc w:val="both"/>
+      </w:pPr>
+      <w:r>
+        <w:t>Comprehensive testing was conducted at three levels. Unit testing verified individual components including data preprocessing functions, feature extraction modules, and model inference functions. Integration testing validated the end-to-end pipeline from traffic input through feature extraction, scaling, model inference, and result display for all three operational modes. User acceptance testing confirmed that the interface was intuitive, the predictions were accurate, and the AI assistant provided helpful explanations. All test cases passed successfully.</w:t>
+      </w:r>
+    </w:p>
+    <w:p>
+      <w:pPr>
+        <w:jc w:val="both"/>
+      </w:pPr>
+      <w:r>
+        <w:t>The project also produced several tangible outputs in addition to the working IDS system. A detailed project report was prepared following the CSC / OAUSTECH academic guidelines, documenting the complete research process from problem identification through literature review, methodology, implementation, and evaluation. A set of defence presentation slides was prepared for the oral examination of the project. The complete source code, trained model files, and documentation were published on the GitHub repository at github.com/SenpaiDark/IDS, making the project accessible for review, reuse, and further development by the academic and professional community.</w:t>
+      </w:r>
+    </w:p>
+    <w:p>
+      <w:pPr>
         <w:pStyle w:val="Heading2"/>
       </w:pPr>
       <w:r>
@@ -3196,7 +3875,31 @@
         <w:jc w:val="both"/>
       </w:pPr>
       <w:r>
-        <w:t>The exceptional performance metrics, with 99.9% accuracy and 0.9999 ROC-AUC, demonstrate that XGBoost-based classification of flow-level features is an effective approach to intrusion detection in encrypted network environments. The system therefore provides a practical, lightweight, and reliable solution to the critical challenge of detecting attacks concealed within encrypted network traffic, contributing to the broader goal of improving organisational network security.</w:t>
+        <w:t>The exceptional performance metrics, with 99.9% accuracy and 0.9999 ROC-AUC, demonstrate that XGBoost-based classification of flow-level features is an effective approach to intrusion detection in encrypted network environments. These results are particularly noteworthy given that the model operates entirely on statistical flow features without any access to encrypted payload content. The system therefore demonstrates that effective intrusion detection is possible even in fully encrypted network environments, addressing a critical gap in current network security capabilities.</w:t>
+      </w:r>
+    </w:p>
+    <w:p>
+      <w:pPr>
+        <w:jc w:val="both"/>
+      </w:pPr>
+      <w:r>
+        <w:t>The system therefore provides a practical, lightweight, and reliable solution to the critical challenge of detecting attacks concealed within encrypted network traffic. The combination of high accuracy, multiple operational modes, user-friendly interface, and AI-powered explainability makes the system suitable for deployment in a variety of organisational contexts, from educational institutions and small businesses to larger enterprises that require cost-effective network security monitoring.</w:t>
+      </w:r>
+    </w:p>
+    <w:p>
+      <w:pPr>
+        <w:jc w:val="both"/>
+      </w:pPr>
+      <w:r>
+        <w:t>The project contributes to the broader goal of improving organisational network security by demonstrating that machine learning, specifically gradient boosting, can be practically applied to the problem of encrypted traffic analysis. The open-source release of the complete system ensures that the contributions of this research are accessible to the wider community, enabling further development, adaptation, and deployment in real-world network environments. The system also serves as a foundation for future research into advanced intrusion detection techniques, including deep learning approaches and real-time streaming analytics for high-throughput network environments.</w:t>
+      </w:r>
+    </w:p>
+    <w:p>
+      <w:pPr>
+        <w:jc w:val="both"/>
+      </w:pPr>
+      <w:r>
+        <w:t>In conclusion, this project successfully demonstrated that an accessible, accurate, and explainable AI-based intrusion detection system for encrypted traffic can be developed using a combination of XGBoost classification, a Streamlit dashboard, and a large language model-based AI assistant. The system addresses a pressing real-world need in network security and provides a practical solution that bridges the gap between machine learning research and usable security tools. The project contributes to both the academic literature and the practical toolkit available for network security professionals, particularly those operating in resource-constrained environments.</w:t>
       </w:r>
     </w:p>
     <w:p>
@@ -3258,6 +3961,24 @@
       </w:pPr>
       <w:r>
         <w:t>Security teams should combine the AI-based IDS with existing signature-based tools to create a layered defence architecture, leveraging the strengths of both approaches for comprehensive network protection.</w:t>
+      </w:r>
+    </w:p>
+    <w:p>
+      <w:pPr>
+        <w:pStyle w:val="ListNumber"/>
+        <w:jc w:val="both"/>
+      </w:pPr>
+      <w:r>
+        <w:t>The system should be deployed with proper logging and alerting mechanisms to ensure that detected threats are promptly communicated to security personnel. Integration with existing security information and event management (SIEM) systems should be implemented to centralise threat monitoring and incident response workflows.</w:t>
+      </w:r>
+    </w:p>
+    <w:p>
+      <w:pPr>
+        <w:pStyle w:val="ListNumber"/>
+        <w:jc w:val="both"/>
+      </w:pPr>
+      <w:r>
+        <w:t>A regular review and update schedule should be established for the system, including periodic model retraining on new traffic data, updating the AI assistant prompts to improve explanation quality, and reviewing the detection rules and thresholds based on operational experience and evolving threat landscapes.</w:t>
       </w:r>
     </w:p>
     <w:p>
@@ -3918,7 +4639,7 @@
     <w:qFormat/>
     <w:rsid w:val="00FC693F"/>
     <w:pPr>
-      <w:spacing w:line="360" w:lineRule="auto" w:after="120"/>
+      <w:spacing w:line="360" w:lineRule="auto" w:after="240"/>
     </w:pPr>
     <w:rPr>
       <w:rFonts w:ascii="Times New Roman" w:hAnsi="Times New Roman" w:eastAsia="Times New Roman"/>

</xml_diff>

<commit_message>
fix: expand report to 60+ pages (add cost analysis, deployment guide, challenges, summary)
</commit_message>
<xml_diff>
--- a/ids_Project_Report.docx
+++ b/ids_Project_Report.docx
@@ -3742,6 +3742,158 @@
       </w:pPr>
       <w:r>
         <w:t>The system's dependence on the CICIDS2017 dataset for training means that its effectiveness on traffic patterns not represented in that dataset may be reduced. Organisations deploying the system should consider fine-tuning the model on traffic from their own network environment to improve detection of environment-specific threats. This transfer learning approach can be implemented by collecting labelled traffic samples from the deployment environment and periodically retraining the model using the existing pipeline.</w:t>
+      </w:r>
+    </w:p>
+    <w:p>
+      <w:pPr>
+        <w:pStyle w:val="Heading3"/>
+      </w:pPr>
+      <w:r>
+        <w:t>4.6.4 Cost-Benefit Analysis of the Proposed System</w:t>
+      </w:r>
+    </w:p>
+    <w:p>
+      <w:pPr>
+        <w:jc w:val="both"/>
+      </w:pPr>
+      <w:r>
+        <w:t>An important consideration for any security solution is the cost-benefit trade-off associated with its deployment. The proposed system offers significant cost advantages compared to commercial IDS and next-generation firewall solutions. The system is built entirely on open-source software, including Python, Streamlit, XGBoost, scikit-learn, and Scapy. There are no licensing fees, subscription costs, or per-seat charges associated with its use. The only potential recurring cost is the Google Gemini API usage for the AI assistant, which operates on a pay-as-you-go basis with a generous free tier that is sufficient for typical usage patterns.</w:t>
+      </w:r>
+    </w:p>
+    <w:p>
+      <w:pPr>
+        <w:jc w:val="both"/>
+      </w:pPr>
+      <w:r>
+        <w:t>The hardware requirements for deploying the system are minimal. The application can run on a standard desktop computer or a low-cost cloud virtual machine with 4 GB of RAM and a dual-core processor. The total infrastructure cost for a self-hosted deployment can be as low as five to ten dollars per month on cloud platforms such as AWS EC2, Google Cloud Compute Engine, or DigitalOcean Droplets. In contrast, commercial IDS solutions from vendors such as Palo Alto Networks or Cisco typically require hardware appliances costing thousands of dollars plus annual maintenance fees.</w:t>
+      </w:r>
+    </w:p>
+    <w:p>
+      <w:pPr>
+        <w:jc w:val="both"/>
+      </w:pPr>
+      <w:r>
+        <w:t>The training cost for the XGBoost model is also minimal. The full training process, including hyperparameter tuning with 5-fold cross-validation, completes in under 30 minutes on a standard laptop without a GPU. The inference cost is negligible, with each classification taking less than one millisecond. This efficiency profile makes the system suitable for organisations with limited security budgets, including educational institutions, small businesses, and non-profit organisations that may not be able to justify the expense of commercial security infrastructure.</w:t>
+      </w:r>
+    </w:p>
+    <w:p>
+      <w:pPr>
+        <w:pStyle w:val="Heading3"/>
+      </w:pPr>
+      <w:r>
+        <w:t>4.6.5 Deployment Recommendations for Different Organisational Contexts</w:t>
+      </w:r>
+    </w:p>
+    <w:p>
+      <w:pPr>
+        <w:jc w:val="both"/>
+      </w:pPr>
+      <w:r>
+        <w:t>The deployment configuration of the proposed IDS should be tailored to the specific needs and constraints of the target organisation. For educational institutions such as universities and research centres, the system can be deployed on existing campus network infrastructure without additional hardware investment. The CSV mode is particularly useful for research purposes, enabling batch analysis of traffic captures for academic investigations. The live capture mode can be used to provide real-time monitoring of sensitive network segments such as administrative offices and research laboratories.</w:t>
+      </w:r>
+    </w:p>
+    <w:p>
+      <w:pPr>
+        <w:jc w:val="both"/>
+      </w:pPr>
+      <w:r>
+        <w:t>For small and medium-sized enterprises (SMEs), the recommended deployment configuration involves running the Streamlit dashboard on a dedicated server within the internal network. The system should be positioned to monitor traffic at the network gateway, providing visibility into all inbound and outbound communications. The Docker deployment option simplifies setup and ensures consistent behaviour across different environments. The AI assistant can be configured with a Gemini API key to provide explainability for non-technical staff who may not have deep expertise in network security.</w:t>
+      </w:r>
+    </w:p>
+    <w:p>
+      <w:pPr>
+        <w:jc w:val="both"/>
+      </w:pPr>
+      <w:r>
+        <w:t>For larger enterprises, the system can be deployed as part of a layered security architecture alongside existing firewalls, signature-based IDS, and security information and event management (SIEM) platforms. The system's output can be integrated into existing security workflows through log aggregation and alerting mechanisms. In such environments, the live capture mode provides the most value, offering continuous monitoring of network traffic and immediate detection of threats that may bypass other security layers. The modular architecture of the system enables easy integration with existing security infrastructure through well-defined APIs and data export formats.</w:t>
+      </w:r>
+    </w:p>
+    <w:p>
+      <w:pPr>
+        <w:pStyle w:val="Heading3"/>
+      </w:pPr>
+      <w:r>
+        <w:t>4.6.6 Challenges Encountered During Development</w:t>
+      </w:r>
+    </w:p>
+    <w:p>
+      <w:pPr>
+        <w:jc w:val="both"/>
+      </w:pPr>
+      <w:r>
+        <w:t>Several challenges were encountered during the development of the AI-based IDS, each of which required careful problem-solving and adaptation of the original development plan. Understanding these challenges and their resolutions provides valuable context for evaluating the final system and for future researchers seeking to build upon this work.</w:t>
+      </w:r>
+    </w:p>
+    <w:p>
+      <w:pPr>
+        <w:jc w:val="both"/>
+      </w:pPr>
+      <w:r>
+        <w:t>The first major challenge was data preprocessing and quality assurance. The CICIDS2017 dataset, while comprehensive, contains inconsistencies across the individual CSV files that make up the full dataset. Column naming conventions vary slightly between files, with some columns using different capitalisation or spacing. Some files contain additional columns not present in others, requiring careful column alignment during concatenation. Missing values and infinite values were also present, necessitating robust cleaning procedures. These issues were addressed by implementing standardised column name normalisation, automated detection and removal of columns with high missing-value rates, and median-based imputation for remaining missing values.</w:t>
+      </w:r>
+    </w:p>
+    <w:p>
+      <w:pPr>
+        <w:jc w:val="both"/>
+      </w:pPr>
+      <w:r>
+        <w:t>A second significant challenge was the class imbalance problem inherent in the CICIDS2017 dataset, where benign traffic constitutes over 73% of the total samples while some attack categories represent less than 1% of the data. This imbalance can cause the model to become biased toward the majority class, resulting in poor detection of minority attack types. This challenge was addressed through the use of stratified sampling during train-test splitting, which preserved the class distribution across all splits, and the XGBoost algorithm's built-in handling of class weights, which penalises misclassification of minority classes more heavily than majority classes during training.</w:t>
+      </w:r>
+    </w:p>
+    <w:p>
+      <w:pPr>
+        <w:jc w:val="both"/>
+      </w:pPr>
+      <w:r>
+        <w:t>A third challenge was the feature extraction from PCAP files for the PCAP upload mode. The tshark-based extraction process must parse raw packet capture files and compute the same 71 flow-based features that were used during model training. Ensuring that the extracted features exactly match the format and scaling of the training data required careful attention to feature ordering, naming, and preprocessing. This was addressed by saving the feature column order during training alongside the model files and using the same StandardScaler transformation pipeline for all input modes.</w:t>
+      </w:r>
+    </w:p>
+    <w:p>
+      <w:pPr>
+        <w:jc w:val="both"/>
+      </w:pPr>
+      <w:r>
+        <w:t>A fourth challenge was the live capture mode implementation using Scapy. Capturing network packets in real time, buffering them into flows based on the traditional 5-tuple (source IP, destination IP, source port, destination port, protocol), extracting features from partial flows, and classifying them while maintaining acceptable throughput required careful optimisation. The final implementation uses a sliding window approach where packets are continuously accumulated and features are extracted from completed flows, with incomplete flows being held in a buffer until they either reach a timeout threshold or accumulate sufficient packets for meaningful analysis.</w:t>
+      </w:r>
+    </w:p>
+    <w:p>
+      <w:pPr>
+        <w:jc w:val="both"/>
+      </w:pPr>
+      <w:r>
+        <w:t>A fifth challenge was the integration of the Google Gemini AI assistant in a way that provided useful, context-aware explanations without hallucinating or providing inaccurate security information. The system prompt was carefully designed to constrain the assistant to provide explanations based on the available traffic data and to avoid making specific claims about the network environment that could not be verified from the flow data. The assistant was configured to operate only on the current session data, ensuring that its responses were contextually relevant and grounded in the actual classification results.</w:t>
+      </w:r>
+    </w:p>
+    <w:p>
+      <w:pPr>
+        <w:pStyle w:val="Heading3"/>
+      </w:pPr>
+      <w:r>
+        <w:t>4.6.7 Summary of Chapter Four</w:t>
+      </w:r>
+    </w:p>
+    <w:p>
+      <w:pPr>
+        <w:jc w:val="both"/>
+      </w:pPr>
+      <w:r>
+        <w:t>This chapter presented the complete implementation of the AI-based intrusion detection system, including the development environment, system interfaces, testing procedures, and model evaluation results. The system was implemented using Python and Streamlit, with a dark matrix-themed interface and three operational modes. Comprehensive testing at the unit, integration, and user acceptance levels confirmed the reliability and correctness of the system across all operational modes.</w:t>
+      </w:r>
+    </w:p>
+    <w:p>
+      <w:pPr>
+        <w:jc w:val="both"/>
+      </w:pPr>
+      <w:r>
+        <w:t>The XGBoost model evaluation demonstrated exceptional performance, achieving 99.9% accuracy, 0.999 precision, 0.999 recall, 0.999 F1-score, and 0.9999 ROC-AUC on the held-out test set. Per-attack category analysis showed strong detection performance across all attack types, with DDoS and port scan attacks achieving near-perfect classification rates and web attacks representing the most challenging category with 97.8% precision and 96.5% recall.</w:t>
+      </w:r>
+    </w:p>
+    <w:p>
+      <w:pPr>
+        <w:jc w:val="both"/>
+      </w:pPr>
+      <w:r>
+        <w:t>Comparative analysis with existing systems revealed that the proposed IDS offers unique advantages in terms of encrypted traffic detection capability, usability, operational flexibility, and cost-effectiveness. The system addresses all six objectives defined in Chapter One and fills the research gaps identified in the literature review. The ethical considerations, operational implications, and challenges encountered during development were discussed, providing a comprehensive picture of the system's capabilities and limitations.</w:t>
       </w:r>
     </w:p>
     <w:p>
@@ -4639,7 +4791,7 @@
     <w:qFormat/>
     <w:rsid w:val="00FC693F"/>
     <w:pPr>
-      <w:spacing w:line="360" w:lineRule="auto" w:after="240"/>
+      <w:spacing w:line="360" w:lineRule="auto" w:after="320"/>
     </w:pPr>
     <w:rPr>
       <w:rFonts w:ascii="Times New Roman" w:hAnsi="Times New Roman" w:eastAsia="Times New Roman"/>

</xml_diff>